<commit_message>
updated resume, cleaned experiences ui,
</commit_message>
<xml_diff>
--- a/public/files/abe-pasion-resume.docx
+++ b/public/files/abe-pasion-resume.docx
@@ -8,12 +8,14 @@
         <w:ind w:right="0"/>
         <w:jc w:val="center"/>
         <w:rPr>
-          <w:b w:val="1"/>
-          <w:bCs w:val="1"/>
-        </w:rPr>
-      </w:pPr>
-      <w:r>
-        <w:rPr>
+          <w:rFonts w:ascii="Times New Roman" w:cs="Times New Roman" w:eastAsia="Times New Roman" w:hAnsi="Times New Roman"/>
+          <w:b w:val="1"/>
+          <w:bCs w:val="1"/>
+        </w:rPr>
+      </w:pPr>
+      <w:r>
+        <w:rPr>
+          <w:rFonts w:ascii="Times New Roman" w:cs="Times New Roman" w:eastAsia="Times New Roman" w:hAnsi="Times New Roman"/>
           <w:b w:val="1"/>
           <w:bCs w:val="1"/>
           <w:sz w:val="48"/>
@@ -34,6 +36,7 @@
         <w:ind w:right="0"/>
         <w:jc w:val="center"/>
         <w:rPr>
+          <w:rFonts w:ascii="Times New Roman" w:cs="Times New Roman" w:eastAsia="Times New Roman" w:hAnsi="Times New Roman"/>
           <w:b w:val="1"/>
           <w:bCs w:val="1"/>
           <w:sz w:val="24"/>
@@ -42,7 +45,7 @@
       </w:pPr>
       <w:r>
         <w:rPr>
-          <w:rFonts w:ascii="Arial" w:cs="Arial" w:eastAsia="Arial" w:hAnsi="Arial"/>
+          <w:rFonts w:ascii="Times New Roman" w:cs="Times New Roman" w:eastAsia="Times New Roman" w:hAnsi="Times New Roman"/>
           <w:color w:val="333333"/>
           <w:sz w:val="20"/>
           <w:szCs w:val="20"/>
@@ -53,7 +56,7 @@
       <w:hyperlink r:id="rId6">
         <w:r>
           <w:rPr>
-            <w:rFonts w:ascii="Arial" w:cs="Arial" w:eastAsia="Arial" w:hAnsi="Arial"/>
+            <w:rFonts w:ascii="Times New Roman" w:cs="Times New Roman" w:eastAsia="Times New Roman" w:hAnsi="Times New Roman"/>
             <w:color w:val="1f4e79"/>
             <w:sz w:val="20"/>
             <w:szCs w:val="20"/>
@@ -65,7 +68,7 @@
       </w:hyperlink>
       <w:r>
         <w:rPr>
-          <w:rFonts w:ascii="Arial" w:cs="Arial" w:eastAsia="Arial" w:hAnsi="Arial"/>
+          <w:rFonts w:ascii="Times New Roman" w:cs="Times New Roman" w:eastAsia="Times New Roman" w:hAnsi="Times New Roman"/>
           <w:color w:val="333333"/>
           <w:sz w:val="20"/>
           <w:szCs w:val="20"/>
@@ -76,7 +79,7 @@
       <w:hyperlink r:id="rId7">
         <w:r>
           <w:rPr>
-            <w:rFonts w:ascii="Arial" w:cs="Arial" w:eastAsia="Arial" w:hAnsi="Arial"/>
+            <w:rFonts w:ascii="Times New Roman" w:cs="Times New Roman" w:eastAsia="Times New Roman" w:hAnsi="Times New Roman"/>
             <w:color w:val="1f4e79"/>
             <w:sz w:val="20"/>
             <w:szCs w:val="20"/>
@@ -100,6 +103,7 @@
         <w:spacing w:after="60" w:before="200" w:lineRule="auto"/>
         <w:ind w:right="0"/>
         <w:rPr>
+          <w:rFonts w:ascii="Times New Roman" w:cs="Times New Roman" w:eastAsia="Times New Roman" w:hAnsi="Times New Roman"/>
           <w:b w:val="1"/>
           <w:bCs w:val="1"/>
           <w:sz w:val="24"/>
@@ -108,7 +112,7 @@
       </w:pPr>
       <w:r>
         <w:rPr>
-          <w:rFonts w:ascii="Arial" w:cs="Arial" w:eastAsia="Arial" w:hAnsi="Arial"/>
+          <w:rFonts w:ascii="Times New Roman" w:cs="Times New Roman" w:eastAsia="Times New Roman" w:hAnsi="Times New Roman"/>
           <w:b w:val="1"/>
           <w:bCs w:val="1"/>
           <w:sz w:val="24"/>
@@ -116,11 +120,6 @@
           <w:rtl w:val="0"/>
         </w:rPr>
         <w:t xml:space="preserve">ACTUARIAL EXAMS</w:t>
-      </w:r>
-      <w:r>
-        <w:rPr>
-          <w:rtl w:val="0"/>
-        </w:rPr>
       </w:r>
     </w:p>
     <w:p>
@@ -131,15 +130,16 @@
         <w:spacing w:after="60" w:before="80" w:lineRule="auto"/>
         <w:ind w:right="0"/>
         <w:rPr>
-          <w:i w:val="1"/>
-          <w:iCs w:val="1"/>
-          <w:sz w:val="22"/>
-          <w:szCs w:val="22"/>
-        </w:rPr>
-      </w:pPr>
-      <w:r>
-        <w:rPr>
-          <w:rFonts w:ascii="Arial" w:cs="Arial" w:eastAsia="Arial" w:hAnsi="Arial"/>
+          <w:rFonts w:ascii="Times New Roman" w:cs="Times New Roman" w:eastAsia="Times New Roman" w:hAnsi="Times New Roman"/>
+          <w:i w:val="1"/>
+          <w:iCs w:val="1"/>
+          <w:sz w:val="22"/>
+          <w:szCs w:val="22"/>
+        </w:rPr>
+      </w:pPr>
+      <w:r>
+        <w:rPr>
+          <w:rFonts w:ascii="Times New Roman" w:cs="Times New Roman" w:eastAsia="Times New Roman" w:hAnsi="Times New Roman"/>
           <w:b w:val="1"/>
           <w:bCs w:val="1"/>
           <w:color w:val="1a1a1a"/>
@@ -149,21 +149,11 @@
         </w:rPr>
         <w:t xml:space="preserve">Exam P</w:t>
         <w:tab/>
-      </w:r>
-      <w:r>
-        <w:rPr>
-          <w:b w:val="1"/>
-          <w:bCs w:val="1"/>
-          <w:color w:val="1a1a1a"/>
-          <w:sz w:val="22"/>
-          <w:szCs w:val="22"/>
-          <w:rtl w:val="0"/>
-        </w:rPr>
         <w:t xml:space="preserve">  </w:t>
       </w:r>
       <w:r>
         <w:rPr>
-          <w:rFonts w:ascii="Arial" w:cs="Arial" w:eastAsia="Arial" w:hAnsi="Arial"/>
+          <w:rFonts w:ascii="Times New Roman" w:cs="Times New Roman" w:eastAsia="Times New Roman" w:hAnsi="Times New Roman"/>
           <w:i w:val="1"/>
           <w:iCs w:val="1"/>
           <w:color w:val="333333"/>
@@ -187,15 +177,16 @@
         <w:spacing w:after="60" w:lineRule="auto"/>
         <w:ind w:right="0"/>
         <w:rPr>
-          <w:i w:val="1"/>
-          <w:iCs w:val="1"/>
-          <w:sz w:val="22"/>
-          <w:szCs w:val="22"/>
-        </w:rPr>
-      </w:pPr>
-      <w:r>
-        <w:rPr>
-          <w:rFonts w:ascii="Arial" w:cs="Arial" w:eastAsia="Arial" w:hAnsi="Arial"/>
+          <w:rFonts w:ascii="Times New Roman" w:cs="Times New Roman" w:eastAsia="Times New Roman" w:hAnsi="Times New Roman"/>
+          <w:i w:val="1"/>
+          <w:iCs w:val="1"/>
+          <w:sz w:val="22"/>
+          <w:szCs w:val="22"/>
+        </w:rPr>
+      </w:pPr>
+      <w:r>
+        <w:rPr>
+          <w:rFonts w:ascii="Times New Roman" w:cs="Times New Roman" w:eastAsia="Times New Roman" w:hAnsi="Times New Roman"/>
           <w:b w:val="1"/>
           <w:bCs w:val="1"/>
           <w:color w:val="1a1a1a"/>
@@ -208,7 +199,7 @@
       </w:r>
       <w:r>
         <w:rPr>
-          <w:rFonts w:ascii="Arial" w:cs="Arial" w:eastAsia="Arial" w:hAnsi="Arial"/>
+          <w:rFonts w:ascii="Times New Roman" w:cs="Times New Roman" w:eastAsia="Times New Roman" w:hAnsi="Times New Roman"/>
           <w:i w:val="1"/>
           <w:iCs w:val="1"/>
           <w:color w:val="333333"/>
@@ -229,18 +220,19 @@
         <w:tabs>
           <w:tab w:val="right" w:leader="none" w:pos="10080"/>
         </w:tabs>
-        <w:spacing w:after="80" w:lineRule="auto"/>
-        <w:ind w:right="0"/>
-        <w:rPr>
-          <w:i w:val="1"/>
-          <w:iCs w:val="1"/>
-          <w:sz w:val="22"/>
-          <w:szCs w:val="22"/>
-        </w:rPr>
-      </w:pPr>
-      <w:r>
-        <w:rPr>
-          <w:rFonts w:ascii="Arial" w:cs="Arial" w:eastAsia="Arial" w:hAnsi="Arial"/>
+        <w:spacing w:after="0" w:lineRule="auto"/>
+        <w:ind w:right="0"/>
+        <w:rPr>
+          <w:rFonts w:ascii="Times New Roman" w:cs="Times New Roman" w:eastAsia="Times New Roman" w:hAnsi="Times New Roman"/>
+          <w:i w:val="1"/>
+          <w:iCs w:val="1"/>
+          <w:sz w:val="22"/>
+          <w:szCs w:val="22"/>
+        </w:rPr>
+      </w:pPr>
+      <w:r>
+        <w:rPr>
+          <w:rFonts w:ascii="Times New Roman" w:cs="Times New Roman" w:eastAsia="Times New Roman" w:hAnsi="Times New Roman"/>
           <w:b w:val="1"/>
           <w:bCs w:val="1"/>
           <w:color w:val="1a1a1a"/>
@@ -250,35 +242,25 @@
         </w:rPr>
         <w:t xml:space="preserve">Exam SRM</w:t>
         <w:tab/>
+        <w:t xml:space="preserve">    </w:t>
+      </w:r>
+      <w:r>
+        <w:rPr>
+          <w:rFonts w:ascii="Times New Roman" w:cs="Times New Roman" w:eastAsia="Times New Roman" w:hAnsi="Times New Roman"/>
+          <w:b w:val="1"/>
+          <w:bCs w:val="1"/>
+          <w:i w:val="1"/>
+          <w:iCs w:val="1"/>
+          <w:color w:val="1a1a1a"/>
+          <w:sz w:val="22"/>
+          <w:szCs w:val="22"/>
+          <w:rtl w:val="0"/>
+        </w:rPr>
         <w:t xml:space="preserve"> </w:t>
       </w:r>
       <w:r>
         <w:rPr>
-          <w:b w:val="1"/>
-          <w:bCs w:val="1"/>
-          <w:color w:val="1a1a1a"/>
-          <w:sz w:val="22"/>
-          <w:szCs w:val="22"/>
-          <w:rtl w:val="0"/>
-        </w:rPr>
-        <w:t xml:space="preserve">   </w:t>
-      </w:r>
-      <w:r>
-        <w:rPr>
-          <w:b w:val="1"/>
-          <w:bCs w:val="1"/>
-          <w:i w:val="1"/>
-          <w:iCs w:val="1"/>
-          <w:color w:val="1a1a1a"/>
-          <w:sz w:val="22"/>
-          <w:szCs w:val="22"/>
-          <w:rtl w:val="0"/>
-        </w:rPr>
-        <w:t xml:space="preserve"> </w:t>
-      </w:r>
-      <w:r>
-        <w:rPr>
-          <w:rFonts w:ascii="Arial" w:cs="Arial" w:eastAsia="Arial" w:hAnsi="Arial"/>
+          <w:rFonts w:ascii="Times New Roman" w:cs="Times New Roman" w:eastAsia="Times New Roman" w:hAnsi="Times New Roman"/>
           <w:i w:val="1"/>
           <w:iCs w:val="1"/>
           <w:color w:val="333333"/>
@@ -299,15 +281,17 @@
         <w:pBdr>
           <w:bottom w:color="1f4e79" w:space="2" w:sz="6" w:val="single"/>
         </w:pBdr>
-        <w:spacing w:after="60" w:before="200" w:lineRule="auto"/>
-        <w:ind w:right="0"/>
-        <w:rPr>
-          <w:b w:val="1"/>
-          <w:bCs w:val="1"/>
-        </w:rPr>
-      </w:pPr>
-      <w:r>
-        <w:rPr>
+        <w:spacing w:after="20" w:before="120" w:lineRule="auto"/>
+        <w:ind w:right="0"/>
+        <w:rPr>
+          <w:rFonts w:ascii="Times New Roman" w:cs="Times New Roman" w:eastAsia="Times New Roman" w:hAnsi="Times New Roman"/>
+          <w:b w:val="1"/>
+          <w:bCs w:val="1"/>
+        </w:rPr>
+      </w:pPr>
+      <w:r>
+        <w:rPr>
+          <w:rFonts w:ascii="Times New Roman" w:cs="Times New Roman" w:eastAsia="Times New Roman" w:hAnsi="Times New Roman"/>
           <w:b w:val="1"/>
           <w:bCs w:val="1"/>
           <w:sz w:val="24"/>
@@ -326,11 +310,13 @@
       <w:pPr>
         <w:spacing w:after="0" w:before="80" w:lineRule="auto"/>
         <w:ind w:right="0"/>
-        <w:rPr/>
-      </w:pPr>
-      <w:r>
-        <w:rPr>
-          <w:rFonts w:ascii="Arial" w:cs="Arial" w:eastAsia="Arial" w:hAnsi="Arial"/>
+        <w:rPr>
+          <w:rFonts w:ascii="Times New Roman" w:cs="Times New Roman" w:eastAsia="Times New Roman" w:hAnsi="Times New Roman"/>
+        </w:rPr>
+      </w:pPr>
+      <w:r>
+        <w:rPr>
+          <w:rFonts w:ascii="Times New Roman" w:cs="Times New Roman" w:eastAsia="Times New Roman" w:hAnsi="Times New Roman"/>
           <w:b w:val="1"/>
           <w:bCs w:val="1"/>
           <w:color w:val="1a1a1a"/>
@@ -342,7 +328,7 @@
       </w:r>
       <w:r>
         <w:rPr>
-          <w:rFonts w:ascii="Arial" w:cs="Arial" w:eastAsia="Arial" w:hAnsi="Arial"/>
+          <w:rFonts w:ascii="Times New Roman" w:cs="Times New Roman" w:eastAsia="Times New Roman" w:hAnsi="Times New Roman"/>
           <w:color w:val="333333"/>
           <w:rtl w:val="0"/>
         </w:rPr>
@@ -358,11 +344,14 @@
       <w:pPr>
         <w:spacing w:after="0" w:lineRule="auto"/>
         <w:ind w:right="0"/>
-        <w:rPr/>
-      </w:pPr>
-      <w:r>
-        <w:rPr>
-          <w:rFonts w:ascii="Arial" w:cs="Arial" w:eastAsia="Arial" w:hAnsi="Arial"/>
+        <w:rPr>
+          <w:rFonts w:ascii="Times New Roman" w:cs="Times New Roman" w:eastAsia="Times New Roman" w:hAnsi="Times New Roman"/>
+          <w:color w:val="333333"/>
+        </w:rPr>
+      </w:pPr>
+      <w:r>
+        <w:rPr>
+          <w:rFonts w:ascii="Times New Roman" w:cs="Times New Roman" w:eastAsia="Times New Roman" w:hAnsi="Times New Roman"/>
           <w:b w:val="1"/>
           <w:bCs w:val="1"/>
           <w:color w:val="1a1a1a"/>
@@ -374,27 +363,15 @@
       </w:r>
       <w:r>
         <w:rPr>
-          <w:rFonts w:ascii="Arial" w:cs="Arial" w:eastAsia="Arial" w:hAnsi="Arial"/>
-          <w:color w:val="333333"/>
-          <w:rtl w:val="0"/>
-        </w:rPr>
-        <w:t xml:space="preserve">Azure Data Lake, Azure Databricks, Azure Data Factory, Power BI, REST APIs</w:t>
-      </w:r>
-      <w:r>
-        <w:rPr>
-          <w:rtl w:val="0"/>
-        </w:rPr>
-      </w:r>
-    </w:p>
-    <w:p>
-      <w:pPr>
-        <w:spacing w:after="0" w:lineRule="auto"/>
-        <w:ind w:right="0"/>
-        <w:rPr/>
-      </w:pPr>
-      <w:r>
-        <w:rPr>
-          <w:rFonts w:ascii="Arial" w:cs="Arial" w:eastAsia="Arial" w:hAnsi="Arial"/>
+          <w:rFonts w:ascii="Times New Roman" w:cs="Times New Roman" w:eastAsia="Times New Roman" w:hAnsi="Times New Roman"/>
+          <w:color w:val="333333"/>
+          <w:rtl w:val="0"/>
+        </w:rPr>
+        <w:t xml:space="preserve">Azure Data Lake, Azure Databricks, Azure Data Factory, Power BI, REST APIs </w:t>
+      </w:r>
+      <w:r>
+        <w:rPr>
+          <w:rFonts w:ascii="Times New Roman" w:cs="Times New Roman" w:eastAsia="Times New Roman" w:hAnsi="Times New Roman"/>
           <w:b w:val="1"/>
           <w:bCs w:val="1"/>
           <w:color w:val="1a1a1a"/>
@@ -406,7 +383,7 @@
       </w:r>
       <w:r>
         <w:rPr>
-          <w:rFonts w:ascii="Arial" w:cs="Arial" w:eastAsia="Arial" w:hAnsi="Arial"/>
+          <w:rFonts w:ascii="Times New Roman" w:cs="Times New Roman" w:eastAsia="Times New Roman" w:hAnsi="Times New Roman"/>
           <w:b w:val="1"/>
           <w:bCs w:val="1"/>
           <w:color w:val="1a1a1a"/>
@@ -416,16 +393,11 @@
       </w:r>
       <w:r>
         <w:rPr>
-          <w:rFonts w:ascii="Arial" w:cs="Arial" w:eastAsia="Arial" w:hAnsi="Arial"/>
-          <w:color w:val="333333"/>
-          <w:rtl w:val="0"/>
-        </w:rPr>
-        <w:t xml:space="preserve">Python, SQL, TypeScript, C++, JavaScript, Jupyter, Git, Selenium, Playwright, Pytest</w:t>
-      </w:r>
-      <w:r>
-        <w:rPr>
-          <w:rtl w:val="0"/>
-        </w:rPr>
+          <w:rFonts w:ascii="Times New Roman" w:cs="Times New Roman" w:eastAsia="Times New Roman" w:hAnsi="Times New Roman"/>
+          <w:color w:val="333333"/>
+          <w:rtl w:val="0"/>
+        </w:rPr>
+        <w:t xml:space="preserve">Python, SQL, TypeScript, C++, JavaScript, Jupyter, Git, Selenium, Playwright, Pytest, Gemini Notebook LM, Github Copilot</w:t>
       </w:r>
     </w:p>
     <w:p>
@@ -433,12 +405,15 @@
         <w:pBdr>
           <w:bottom w:color="1f4e79" w:space="2" w:sz="6" w:val="single"/>
         </w:pBdr>
-        <w:spacing w:after="60" w:before="200" w:lineRule="auto"/>
-        <w:ind w:right="0"/>
-        <w:rPr/>
-      </w:pPr>
-      <w:r>
-        <w:rPr>
+        <w:spacing w:after="60" w:before="120" w:lineRule="auto"/>
+        <w:ind w:right="0"/>
+        <w:rPr>
+          <w:rFonts w:ascii="Times New Roman" w:cs="Times New Roman" w:eastAsia="Times New Roman" w:hAnsi="Times New Roman"/>
+        </w:rPr>
+      </w:pPr>
+      <w:r>
+        <w:rPr>
+          <w:rFonts w:ascii="Times New Roman" w:cs="Times New Roman" w:eastAsia="Times New Roman" w:hAnsi="Times New Roman"/>
           <w:b w:val="1"/>
           <w:bCs w:val="1"/>
           <w:sz w:val="24"/>
@@ -461,6 +436,7 @@
         <w:spacing w:after="0" w:before="0" w:line="240" w:lineRule="auto"/>
         <w:ind w:right="0"/>
         <w:rPr>
+          <w:rFonts w:ascii="Times New Roman" w:cs="Times New Roman" w:eastAsia="Times New Roman" w:hAnsi="Times New Roman"/>
           <w:i w:val="1"/>
           <w:iCs w:val="1"/>
           <w:color w:val="666666"/>
@@ -470,6 +446,7 @@
       </w:pPr>
       <w:r>
         <w:rPr>
+          <w:rFonts w:ascii="Times New Roman" w:cs="Times New Roman" w:eastAsia="Times New Roman" w:hAnsi="Times New Roman"/>
           <w:b w:val="1"/>
           <w:bCs w:val="1"/>
           <w:color w:val="1a1a1a"/>
@@ -481,6 +458,7 @@
       </w:r>
       <w:r>
         <w:rPr>
+          <w:rFonts w:ascii="Times New Roman" w:cs="Times New Roman" w:eastAsia="Times New Roman" w:hAnsi="Times New Roman"/>
           <w:color w:val="888888"/>
           <w:sz w:val="22"/>
           <w:szCs w:val="22"/>
@@ -490,6 +468,7 @@
       </w:r>
       <w:r>
         <w:rPr>
+          <w:rFonts w:ascii="Times New Roman" w:cs="Times New Roman" w:eastAsia="Times New Roman" w:hAnsi="Times New Roman"/>
           <w:i w:val="1"/>
           <w:iCs w:val="1"/>
           <w:color w:val="666666"/>
@@ -508,34 +487,38 @@
         <w:spacing w:after="0" w:before="0" w:line="240" w:lineRule="auto"/>
         <w:ind w:right="0"/>
         <w:rPr>
+          <w:rFonts w:ascii="Times New Roman" w:cs="Times New Roman" w:eastAsia="Times New Roman" w:hAnsi="Times New Roman"/>
+          <w:color w:val="333333"/>
+        </w:rPr>
+      </w:pPr>
+      <w:r>
+        <w:rPr>
+          <w:rFonts w:ascii="Times New Roman" w:cs="Times New Roman" w:eastAsia="Times New Roman" w:hAnsi="Times New Roman"/>
+          <w:i w:val="1"/>
+          <w:iCs w:val="1"/>
+          <w:color w:val="1a1a1a"/>
+          <w:sz w:val="22"/>
+          <w:szCs w:val="22"/>
+          <w:rtl w:val="0"/>
+        </w:rPr>
+        <w:t xml:space="preserve">BI Developer / Data Analyst</w:t>
+      </w:r>
+      <w:r>
+        <w:rPr>
+          <w:rFonts w:ascii="Times New Roman" w:cs="Times New Roman" w:eastAsia="Times New Roman" w:hAnsi="Times New Roman"/>
           <w:i w:val="1"/>
           <w:iCs w:val="1"/>
           <w:color w:val="888888"/>
           <w:sz w:val="22"/>
           <w:szCs w:val="22"/>
-        </w:rPr>
-      </w:pPr>
-      <w:r>
-        <w:rPr>
-          <w:i w:val="1"/>
-          <w:iCs w:val="1"/>
-          <w:color w:val="1a1a1a"/>
-          <w:sz w:val="22"/>
-          <w:szCs w:val="22"/>
-          <w:rtl w:val="0"/>
-        </w:rPr>
-        <w:t xml:space="preserve">BI Developer / Data Analyst</w:t>
-      </w:r>
-      <w:r>
-        <w:rPr>
-          <w:i w:val="1"/>
-          <w:iCs w:val="1"/>
-          <w:color w:val="888888"/>
-          <w:sz w:val="22"/>
-          <w:szCs w:val="22"/>
           <w:rtl w:val="0"/>
         </w:rPr>
         <w:t xml:space="preserve"> </w:t>
+      </w:r>
+      <w:r>
+        <w:rPr>
+          <w:rtl w:val="0"/>
+        </w:rPr>
       </w:r>
     </w:p>
     <w:p>
@@ -544,19 +527,220 @@
           <w:ilvl w:val="0"/>
           <w:numId w:val="1"/>
         </w:numPr>
+        <w:spacing w:after="40" w:before="40" w:lineRule="auto"/>
+        <w:ind w:left="440" w:hanging="260"/>
+        <w:rPr>
+          <w:rFonts w:ascii="Times New Roman" w:cs="Times New Roman" w:eastAsia="Times New Roman" w:hAnsi="Times New Roman"/>
+        </w:rPr>
+      </w:pPr>
+      <w:r>
+        <w:rPr>
+          <w:rFonts w:ascii="Times New Roman" w:cs="Times New Roman" w:eastAsia="Times New Roman" w:hAnsi="Times New Roman"/>
+          <w:color w:val="333333"/>
+          <w:rtl w:val="0"/>
+        </w:rPr>
+        <w:t xml:space="preserve">Developed SQL, Python, and VBA–based analytics and automation pipelines to reconcile traffic and pricing data between source systems and reporting layers, reducing manual validation effort by ~60% and improving data reliability for statewide decision-making</w:t>
+      </w:r>
+    </w:p>
+    <w:p>
+      <w:pPr>
+        <w:numPr>
+          <w:ilvl w:val="0"/>
+          <w:numId w:val="1"/>
+        </w:numPr>
+        <w:spacing w:after="40" w:before="40" w:lineRule="auto"/>
+        <w:ind w:left="440" w:hanging="260"/>
+        <w:rPr>
+          <w:rFonts w:ascii="Times New Roman" w:cs="Times New Roman" w:eastAsia="Times New Roman" w:hAnsi="Times New Roman"/>
+        </w:rPr>
+      </w:pPr>
+      <w:r>
+        <w:rPr>
+          <w:rFonts w:ascii="Times New Roman" w:cs="Times New Roman" w:eastAsia="Times New Roman" w:hAnsi="Times New Roman"/>
+          <w:color w:val="333333"/>
+          <w:rtl w:val="0"/>
+        </w:rPr>
+        <w:t xml:space="preserve">Analyzed statewide traffic and Dynamic Message Sign (DMS) datasets to validate operational accuracy across 28 transportation subsystems, supporting FDOT’s traffic management and pricing strategies for express lanes</w:t>
+      </w:r>
+    </w:p>
+    <w:p>
+      <w:pPr>
+        <w:numPr>
+          <w:ilvl w:val="0"/>
+          <w:numId w:val="1"/>
+        </w:numPr>
+        <w:spacing w:after="40" w:before="40" w:lineRule="auto"/>
+        <w:ind w:left="440" w:hanging="260"/>
+        <w:rPr>
+          <w:rFonts w:ascii="Times New Roman" w:cs="Times New Roman" w:eastAsia="Times New Roman" w:hAnsi="Times New Roman"/>
+        </w:rPr>
+      </w:pPr>
+      <w:r>
+        <w:rPr>
+          <w:rFonts w:ascii="Times New Roman" w:cs="Times New Roman" w:eastAsia="Times New Roman" w:hAnsi="Times New Roman"/>
+          <w:color w:val="333333"/>
+          <w:rtl w:val="0"/>
+        </w:rPr>
+        <w:t xml:space="preserve">Designed reusable validation frameworks and dashboards to surface SLA risks, trend anomalies, and release readiness metrics, accelerating test and release cycles across three statewide deployments (2 SunGuide hotfixes, 1 SELS release)</w:t>
+      </w:r>
+    </w:p>
+    <w:p>
+      <w:pPr>
+        <w:numPr>
+          <w:ilvl w:val="0"/>
+          <w:numId w:val="1"/>
+        </w:numPr>
+        <w:spacing w:after="40" w:before="40" w:lineRule="auto"/>
+        <w:ind w:left="440" w:hanging="260"/>
+        <w:rPr>
+          <w:rFonts w:ascii="Times New Roman" w:cs="Times New Roman" w:eastAsia="Times New Roman" w:hAnsi="Times New Roman"/>
+        </w:rPr>
+      </w:pPr>
+      <w:r>
+        <w:rPr>
+          <w:rFonts w:ascii="Times New Roman" w:cs="Times New Roman" w:eastAsia="Times New Roman" w:hAnsi="Times New Roman"/>
+          <w:color w:val="333333"/>
+          <w:rtl w:val="0"/>
+        </w:rPr>
+        <w:t xml:space="preserve">Partnered directly with FDOT stakeholders, developers, and BI teams to translate business and operational requirements into measurable data checks, curated datasets, and reporting outputs used by internal and external consumers</w:t>
+      </w:r>
+    </w:p>
+    <w:p>
+      <w:pPr>
+        <w:numPr>
+          <w:ilvl w:val="0"/>
+          <w:numId w:val="1"/>
+        </w:numPr>
+        <w:spacing w:after="40" w:before="40" w:lineRule="auto"/>
+        <w:ind w:left="440" w:hanging="260"/>
+        <w:rPr>
+          <w:rFonts w:ascii="Times New Roman" w:cs="Times New Roman" w:eastAsia="Times New Roman" w:hAnsi="Times New Roman"/>
+        </w:rPr>
+      </w:pPr>
+      <w:r>
+        <w:rPr>
+          <w:rFonts w:ascii="Times New Roman" w:cs="Times New Roman" w:eastAsia="Times New Roman" w:hAnsi="Times New Roman"/>
+          <w:color w:val="333333"/>
+          <w:rtl w:val="0"/>
+        </w:rPr>
+        <w:t xml:space="preserve">Supported ingestion and transformation of 20+ enterprise datasets, ensuring accuracy and consistency across reporting workflows used for operational monitoring and client-facing dashboards</w:t>
+      </w:r>
+    </w:p>
+    <w:p>
+      <w:pPr>
+        <w:numPr>
+          <w:ilvl w:val="0"/>
+          <w:numId w:val="1"/>
+        </w:numPr>
+        <w:spacing w:after="40" w:before="40" w:lineRule="auto"/>
+        <w:ind w:left="440" w:hanging="260"/>
+        <w:rPr>
+          <w:rFonts w:ascii="Times New Roman" w:cs="Times New Roman" w:eastAsia="Times New Roman" w:hAnsi="Times New Roman"/>
+        </w:rPr>
+      </w:pPr>
+      <w:r>
+        <w:rPr>
+          <w:rFonts w:ascii="Times New Roman" w:cs="Times New Roman" w:eastAsia="Times New Roman" w:hAnsi="Times New Roman"/>
+          <w:color w:val="333333"/>
+          <w:rtl w:val="0"/>
+        </w:rPr>
+        <w:t xml:space="preserve">Leveraged LLM-assisted documentation analysis (self-hosted Ollama, Gemini Notebook LM) to extract requirements and generate structured validation artifacts, improving analysis throughput and accelerating development timelines by 40%+</w:t>
+      </w:r>
+      <w:r>
+        <w:rPr>
+          <w:rtl w:val="0"/>
+        </w:rPr>
+      </w:r>
+    </w:p>
+    <w:p>
+      <w:pPr>
         <w:tabs>
           <w:tab w:val="right" w:leader="none" w:pos="10350"/>
         </w:tabs>
         <w:spacing w:after="0" w:before="0" w:lineRule="auto"/>
-        <w:ind w:left="440" w:right="0" w:hanging="260"/>
-      </w:pPr>
-      <w:r>
-        <w:rPr>
-          <w:rFonts w:ascii="Arial Unicode MS" w:cs="Arial Unicode MS" w:eastAsia="Arial Unicode MS" w:hAnsi="Arial Unicode MS"/>
-          <w:color w:val="333333"/>
-          <w:rtl w:val="0"/>
-        </w:rPr>
-        <w:t xml:space="preserve">Designed and executed data validation and reconciliation frameworks across Azure ingestion pipelines (ADF → ADLS → Databricks), surfacing 1,000+ data inconsistencies across Bronze and Silver layers — contributing to a ~40% reduction in downstream reporting defects post-release</w:t>
+        <w:ind w:right="0"/>
+        <w:rPr>
+          <w:rFonts w:ascii="Times New Roman" w:cs="Times New Roman" w:eastAsia="Times New Roman" w:hAnsi="Times New Roman"/>
+          <w:i w:val="1"/>
+          <w:iCs w:val="1"/>
+          <w:color w:val="666666"/>
+          <w:sz w:val="20"/>
+          <w:szCs w:val="20"/>
+        </w:rPr>
+      </w:pPr>
+      <w:r>
+        <w:rPr>
+          <w:rFonts w:ascii="Times New Roman" w:cs="Times New Roman" w:eastAsia="Times New Roman" w:hAnsi="Times New Roman"/>
+          <w:b w:val="1"/>
+          <w:bCs w:val="1"/>
+          <w:color w:val="1a1a1a"/>
+          <w:sz w:val="22"/>
+          <w:szCs w:val="22"/>
+          <w:rtl w:val="0"/>
+        </w:rPr>
+        <w:t xml:space="preserve">Shop Online New York</w:t>
+      </w:r>
+      <w:r>
+        <w:rPr>
+          <w:rFonts w:ascii="Times New Roman" w:cs="Times New Roman" w:eastAsia="Times New Roman" w:hAnsi="Times New Roman"/>
+          <w:color w:val="888888"/>
+          <w:rtl w:val="0"/>
+        </w:rPr>
+        <w:tab/>
+      </w:r>
+      <w:r>
+        <w:rPr>
+          <w:rFonts w:ascii="Times New Roman" w:cs="Times New Roman" w:eastAsia="Times New Roman" w:hAnsi="Times New Roman"/>
+          <w:i w:val="1"/>
+          <w:iCs w:val="1"/>
+          <w:color w:val="666666"/>
+          <w:rtl w:val="0"/>
+        </w:rPr>
+        <w:t xml:space="preserve">Feb</w:t>
+      </w:r>
+      <w:r>
+        <w:rPr>
+          <w:rFonts w:ascii="Times New Roman" w:cs="Times New Roman" w:eastAsia="Times New Roman" w:hAnsi="Times New Roman"/>
+          <w:i w:val="1"/>
+          <w:iCs w:val="1"/>
+          <w:color w:val="666666"/>
+          <w:sz w:val="20"/>
+          <w:szCs w:val="20"/>
+          <w:rtl w:val="0"/>
+        </w:rPr>
+        <w:t xml:space="preserve"> 2025 – Apr 2025</w:t>
+      </w:r>
+    </w:p>
+    <w:p>
+      <w:pPr>
+        <w:tabs>
+          <w:tab w:val="right" w:leader="none" w:pos="10350"/>
+        </w:tabs>
+        <w:spacing w:after="0" w:before="0" w:lineRule="auto"/>
+        <w:ind w:right="0"/>
+        <w:rPr>
+          <w:rFonts w:ascii="Times New Roman" w:cs="Times New Roman" w:eastAsia="Times New Roman" w:hAnsi="Times New Roman"/>
+          <w:i w:val="1"/>
+          <w:iCs w:val="1"/>
+          <w:color w:val="666666"/>
+        </w:rPr>
+      </w:pPr>
+      <w:r>
+        <w:rPr>
+          <w:rFonts w:ascii="Times New Roman" w:cs="Times New Roman" w:eastAsia="Times New Roman" w:hAnsi="Times New Roman"/>
+          <w:i w:val="1"/>
+          <w:iCs w:val="1"/>
+          <w:color w:val="1a1a1a"/>
+          <w:sz w:val="22"/>
+          <w:szCs w:val="22"/>
+          <w:rtl w:val="0"/>
+        </w:rPr>
+        <w:t xml:space="preserve">Software Developer Intern</w:t>
+      </w:r>
+      <w:r>
+        <w:rPr>
+          <w:rtl w:val="0"/>
+        </w:rPr>
       </w:r>
     </w:p>
     <w:p>
@@ -577,29 +761,20 @@
           <w:between w:space="0" w:sz="0" w:val="nil"/>
         </w:pBdr>
         <w:shd w:fill="auto" w:val="clear"/>
-        <w:spacing w:after="60" w:before="0" w:line="240" w:lineRule="auto"/>
+        <w:spacing w:after="40" w:before="40" w:line="240" w:lineRule="auto"/>
         <w:ind w:left="440" w:right="0" w:hanging="260"/>
         <w:jc w:val="left"/>
-        <w:rPr/>
-      </w:pPr>
-      <w:r>
-        <w:rPr>
-          <w:rFonts w:ascii="Arial" w:cs="Arial" w:eastAsia="Arial" w:hAnsi="Arial"/>
-          <w:b w:val="0"/>
-          <w:bCs w:val="0"/>
-          <w:i w:val="0"/>
-          <w:iCs w:val="0"/>
-          <w:smallCaps w:val="0"/>
-          <w:strike w:val="0"/>
-          <w:color w:val="333333"/>
-          <w:sz w:val="20"/>
-          <w:szCs w:val="20"/>
-          <w:u w:val="none"/>
-          <w:shd w:fill="auto" w:val="clear"/>
-          <w:vertAlign w:val="baseline"/>
-          <w:rtl w:val="0"/>
-        </w:rPr>
-        <w:t xml:space="preserve">Built Python and SQL automation scripts for daily data reconciliation between source systems and reporting layers, eliminating ~60% of manual validation effort and establishing a single source of truth</w:t>
+        <w:rPr>
+          <w:rFonts w:ascii="Times New Roman" w:cs="Times New Roman" w:eastAsia="Times New Roman" w:hAnsi="Times New Roman"/>
+        </w:rPr>
+      </w:pPr>
+      <w:r>
+        <w:rPr>
+          <w:rFonts w:ascii="Times New Roman" w:cs="Times New Roman" w:eastAsia="Times New Roman" w:hAnsi="Times New Roman"/>
+          <w:color w:val="333333"/>
+          <w:rtl w:val="0"/>
+        </w:rPr>
+        <w:t xml:space="preserve">Built a cross-platform Flutter application supporting four role-based user types, implementing access controls and structured data flows to reduce authorization defects and improve system reliability</w:t>
       </w:r>
       <w:r>
         <w:rPr>
@@ -625,29 +800,107 @@
           <w:between w:space="0" w:sz="0" w:val="nil"/>
         </w:pBdr>
         <w:shd w:fill="auto" w:val="clear"/>
-        <w:spacing w:after="60" w:before="0" w:line="240" w:lineRule="auto"/>
+        <w:spacing w:after="40" w:before="40" w:line="240" w:lineRule="auto"/>
         <w:ind w:left="440" w:right="0" w:hanging="260"/>
         <w:jc w:val="left"/>
-        <w:rPr/>
-      </w:pPr>
-      <w:r>
-        <w:rPr>
-          <w:rFonts w:ascii="Arial" w:cs="Arial" w:eastAsia="Arial" w:hAnsi="Arial"/>
-          <w:b w:val="0"/>
-          <w:bCs w:val="0"/>
-          <w:i w:val="0"/>
-          <w:iCs w:val="0"/>
-          <w:smallCaps w:val="0"/>
-          <w:strike w:val="0"/>
-          <w:color w:val="333333"/>
+        <w:rPr>
+          <w:rFonts w:ascii="Times New Roman" w:cs="Times New Roman" w:eastAsia="Times New Roman" w:hAnsi="Times New Roman"/>
+        </w:rPr>
+      </w:pPr>
+      <w:r>
+        <w:rPr>
+          <w:rFonts w:ascii="Times New Roman" w:cs="Times New Roman" w:eastAsia="Times New Roman" w:hAnsi="Times New Roman"/>
+          <w:color w:val="333333"/>
+          <w:rtl w:val="0"/>
+        </w:rPr>
+        <w:t xml:space="preserve">Integrated Firebase for real-time data ingestion, authentication, and storage; managed the full Jira ticket lifecycle, translating functional requirements into deliverable features</w:t>
+      </w:r>
+    </w:p>
+    <w:p>
+      <w:pPr>
+        <w:tabs>
+          <w:tab w:val="right" w:leader="none" w:pos="10080"/>
+        </w:tabs>
+        <w:spacing w:after="0" w:before="0" w:lineRule="auto"/>
+        <w:ind w:right="0"/>
+        <w:rPr>
+          <w:rFonts w:ascii="Times New Roman" w:cs="Times New Roman" w:eastAsia="Times New Roman" w:hAnsi="Times New Roman"/>
+          <w:i w:val="1"/>
+          <w:iCs w:val="1"/>
+          <w:color w:val="666666"/>
           <w:sz w:val="20"/>
           <w:szCs w:val="20"/>
-          <w:u w:val="none"/>
-          <w:shd w:fill="auto" w:val="clear"/>
-          <w:vertAlign w:val="baseline"/>
-          <w:rtl w:val="0"/>
-        </w:rPr>
-        <w:t xml:space="preserve">Leveraged Azure OpenAI (Foundry models) and self-hosted Ollama LLMs to generate templated test cases and Jira tickets, accelerating test development velocity by 40%+</w:t>
+        </w:rPr>
+      </w:pPr>
+      <w:r>
+        <w:rPr>
+          <w:rFonts w:ascii="Times New Roman" w:cs="Times New Roman" w:eastAsia="Times New Roman" w:hAnsi="Times New Roman"/>
+          <w:b w:val="1"/>
+          <w:bCs w:val="1"/>
+          <w:color w:val="1a1a1a"/>
+          <w:sz w:val="22"/>
+          <w:szCs w:val="22"/>
+          <w:rtl w:val="0"/>
+        </w:rPr>
+        <w:t xml:space="preserve">Florida State University</w:t>
+      </w:r>
+      <w:r>
+        <w:rPr>
+          <w:rFonts w:ascii="Times New Roman" w:cs="Times New Roman" w:eastAsia="Times New Roman" w:hAnsi="Times New Roman"/>
+          <w:color w:val="888888"/>
+          <w:rtl w:val="0"/>
+        </w:rPr>
+        <w:t xml:space="preserve"> </w:t>
+        <w:tab/>
+      </w:r>
+      <w:r>
+        <w:rPr>
+          <w:rFonts w:ascii="Times New Roman" w:cs="Times New Roman" w:eastAsia="Times New Roman" w:hAnsi="Times New Roman"/>
+          <w:i w:val="1"/>
+          <w:iCs w:val="1"/>
+          <w:color w:val="666666"/>
+          <w:rtl w:val="0"/>
+        </w:rPr>
+        <w:t xml:space="preserve">Sep</w:t>
+      </w:r>
+      <w:r>
+        <w:rPr>
+          <w:rFonts w:ascii="Times New Roman" w:cs="Times New Roman" w:eastAsia="Times New Roman" w:hAnsi="Times New Roman"/>
+          <w:i w:val="1"/>
+          <w:iCs w:val="1"/>
+          <w:color w:val="666666"/>
+          <w:sz w:val="20"/>
+          <w:szCs w:val="20"/>
+          <w:rtl w:val="0"/>
+        </w:rPr>
+        <w:t xml:space="preserve"> 2023 – May 2024</w:t>
+      </w:r>
+    </w:p>
+    <w:p>
+      <w:pPr>
+        <w:tabs>
+          <w:tab w:val="right" w:leader="none" w:pos="10350"/>
+        </w:tabs>
+        <w:spacing w:after="0" w:before="0" w:lineRule="auto"/>
+        <w:ind w:right="0"/>
+        <w:rPr>
+          <w:rFonts w:ascii="Times New Roman" w:cs="Times New Roman" w:eastAsia="Times New Roman" w:hAnsi="Times New Roman"/>
+          <w:i w:val="1"/>
+          <w:iCs w:val="1"/>
+          <w:color w:val="666666"/>
+        </w:rPr>
+      </w:pPr>
+      <w:r>
+        <w:rPr>
+          <w:rFonts w:ascii="Times New Roman" w:cs="Times New Roman" w:eastAsia="Times New Roman" w:hAnsi="Times New Roman"/>
+          <w:i w:val="1"/>
+          <w:iCs w:val="1"/>
+          <w:color w:val="1a1a1a"/>
+          <w:sz w:val="22"/>
+          <w:szCs w:val="22"/>
+          <w:rtl w:val="0"/>
+        </w:rPr>
+        <w:t xml:space="preserve">Cybersecurity Analyst Intern</w:t>
       </w:r>
       <w:r>
         <w:rPr>
@@ -673,29 +926,20 @@
           <w:between w:space="0" w:sz="0" w:val="nil"/>
         </w:pBdr>
         <w:shd w:fill="auto" w:val="clear"/>
-        <w:spacing w:after="60" w:before="0" w:line="240" w:lineRule="auto"/>
+        <w:spacing w:after="40" w:before="40" w:line="240" w:lineRule="auto"/>
         <w:ind w:left="440" w:right="0" w:hanging="260"/>
         <w:jc w:val="left"/>
-        <w:rPr/>
-      </w:pPr>
-      <w:r>
-        <w:rPr>
-          <w:rFonts w:ascii="Arial" w:cs="Arial" w:eastAsia="Arial" w:hAnsi="Arial"/>
-          <w:b w:val="0"/>
-          <w:bCs w:val="0"/>
-          <w:i w:val="0"/>
-          <w:iCs w:val="0"/>
-          <w:smallCaps w:val="0"/>
-          <w:strike w:val="0"/>
-          <w:color w:val="333333"/>
-          <w:sz w:val="20"/>
-          <w:szCs w:val="20"/>
-          <w:u w:val="none"/>
-          <w:shd w:fill="auto" w:val="clear"/>
-          <w:vertAlign w:val="baseline"/>
-          <w:rtl w:val="0"/>
-        </w:rPr>
-        <w:t xml:space="preserve">Supported ingestion of 20+ enterprise datasets into Azure Data Lake Storage and validated Databricks Spark transformation workflows to ensure SLA-driven reporting accuracy</w:t>
+        <w:rPr>
+          <w:rFonts w:ascii="Times New Roman" w:cs="Times New Roman" w:eastAsia="Times New Roman" w:hAnsi="Times New Roman"/>
+        </w:rPr>
+      </w:pPr>
+      <w:r>
+        <w:rPr>
+          <w:rFonts w:ascii="Times New Roman" w:cs="Times New Roman" w:eastAsia="Times New Roman" w:hAnsi="Times New Roman"/>
+          <w:color w:val="333333"/>
+          <w:rtl w:val="0"/>
+        </w:rPr>
+        <w:t xml:space="preserve">Standardized security and compliance controls for FSU Health Research teams, aligning workflows to NIST 800-53 and FedRAMP Moderate, reducing audit preparation effort and compliance ambiguity</w:t>
       </w:r>
       <w:r>
         <w:rPr>
@@ -721,29 +965,92 @@
           <w:between w:space="0" w:sz="0" w:val="nil"/>
         </w:pBdr>
         <w:shd w:fill="auto" w:val="clear"/>
-        <w:spacing w:after="60" w:before="0" w:line="240" w:lineRule="auto"/>
+        <w:spacing w:after="40" w:before="40" w:line="240" w:lineRule="auto"/>
         <w:ind w:left="440" w:right="0" w:hanging="260"/>
         <w:jc w:val="left"/>
-        <w:rPr/>
-      </w:pPr>
-      <w:r>
-        <w:rPr>
-          <w:rFonts w:ascii="Arial" w:cs="Arial" w:eastAsia="Arial" w:hAnsi="Arial"/>
-          <w:b w:val="0"/>
-          <w:bCs w:val="0"/>
-          <w:i w:val="0"/>
-          <w:iCs w:val="0"/>
-          <w:smallCaps w:val="0"/>
-          <w:strike w:val="0"/>
-          <w:color w:val="333333"/>
-          <w:sz w:val="20"/>
-          <w:szCs w:val="20"/>
-          <w:u w:val="none"/>
-          <w:shd w:fill="auto" w:val="clear"/>
-          <w:vertAlign w:val="baseline"/>
-          <w:rtl w:val="0"/>
-        </w:rPr>
-        <w:t xml:space="preserve">Partnered with BI teams to publish curated data marts powering operational and client-facing dashboards for internal and external stakeholders</w:t>
+        <w:rPr>
+          <w:rFonts w:ascii="Times New Roman" w:cs="Times New Roman" w:eastAsia="Times New Roman" w:hAnsi="Times New Roman"/>
+        </w:rPr>
+      </w:pPr>
+      <w:r>
+        <w:rPr>
+          <w:rFonts w:ascii="Times New Roman" w:cs="Times New Roman" w:eastAsia="Times New Roman" w:hAnsi="Times New Roman"/>
+          <w:color w:val="333333"/>
+          <w:rtl w:val="0"/>
+        </w:rPr>
+        <w:t xml:space="preserve">Conducted risk assessments and control gap analysis across Azure and Alert Logic integrations, evaluating identity management, logging, and data protection controls for health data systems</w:t>
+      </w:r>
+    </w:p>
+    <w:p>
+      <w:pPr>
+        <w:tabs>
+          <w:tab w:val="right" w:leader="none" w:pos="10080"/>
+        </w:tabs>
+        <w:spacing w:after="0" w:before="0" w:lineRule="auto"/>
+        <w:ind w:right="0"/>
+        <w:rPr>
+          <w:rFonts w:ascii="Times New Roman" w:cs="Times New Roman" w:eastAsia="Times New Roman" w:hAnsi="Times New Roman"/>
+          <w:i w:val="1"/>
+          <w:iCs w:val="1"/>
+          <w:color w:val="666666"/>
+        </w:rPr>
+      </w:pPr>
+      <w:r>
+        <w:rPr>
+          <w:rFonts w:ascii="Times New Roman" w:cs="Times New Roman" w:eastAsia="Times New Roman" w:hAnsi="Times New Roman"/>
+          <w:b w:val="1"/>
+          <w:bCs w:val="1"/>
+          <w:color w:val="1a1a1a"/>
+          <w:sz w:val="22"/>
+          <w:szCs w:val="22"/>
+          <w:rtl w:val="0"/>
+        </w:rPr>
+        <w:t xml:space="preserve">Mathnasium </w:t>
+      </w:r>
+      <w:r>
+        <w:rPr>
+          <w:rFonts w:ascii="Times New Roman" w:cs="Times New Roman" w:eastAsia="Times New Roman" w:hAnsi="Times New Roman"/>
+          <w:color w:val="888888"/>
+          <w:rtl w:val="0"/>
+        </w:rPr>
+        <w:tab/>
+      </w:r>
+      <w:r>
+        <w:rPr>
+          <w:rFonts w:ascii="Times New Roman" w:cs="Times New Roman" w:eastAsia="Times New Roman" w:hAnsi="Times New Roman"/>
+          <w:i w:val="1"/>
+          <w:iCs w:val="1"/>
+          <w:color w:val="666666"/>
+          <w:rtl w:val="0"/>
+        </w:rPr>
+        <w:t xml:space="preserve">Sep 2022 – Aug 2023</w:t>
+      </w:r>
+    </w:p>
+    <w:p>
+      <w:pPr>
+        <w:tabs>
+          <w:tab w:val="right" w:leader="none" w:pos="10350"/>
+        </w:tabs>
+        <w:spacing w:after="0" w:before="0" w:lineRule="auto"/>
+        <w:ind w:right="0"/>
+        <w:rPr>
+          <w:rFonts w:ascii="Times New Roman" w:cs="Times New Roman" w:eastAsia="Times New Roman" w:hAnsi="Times New Roman"/>
+          <w:i w:val="1"/>
+          <w:iCs w:val="1"/>
+          <w:color w:val="666666"/>
+        </w:rPr>
+      </w:pPr>
+      <w:r>
+        <w:rPr>
+          <w:rFonts w:ascii="Times New Roman" w:cs="Times New Roman" w:eastAsia="Times New Roman" w:hAnsi="Times New Roman"/>
+          <w:i w:val="1"/>
+          <w:iCs w:val="1"/>
+          <w:color w:val="1a1a1a"/>
+          <w:sz w:val="22"/>
+          <w:szCs w:val="22"/>
+          <w:rtl w:val="0"/>
+        </w:rPr>
+        <w:t xml:space="preserve">Mathematics Tutor</w:t>
       </w:r>
       <w:r>
         <w:rPr>
@@ -769,115 +1076,20 @@
           <w:between w:space="0" w:sz="0" w:val="nil"/>
         </w:pBdr>
         <w:shd w:fill="auto" w:val="clear"/>
-        <w:spacing w:after="80" w:before="0" w:line="240" w:lineRule="auto"/>
+        <w:spacing w:after="40" w:before="40" w:line="240" w:lineRule="auto"/>
         <w:ind w:left="440" w:right="0" w:hanging="260"/>
         <w:jc w:val="left"/>
-        <w:rPr/>
-      </w:pPr>
-      <w:r>
-        <w:rPr>
-          <w:rFonts w:ascii="Arial" w:cs="Arial" w:eastAsia="Arial" w:hAnsi="Arial"/>
-          <w:b w:val="0"/>
-          <w:bCs w:val="0"/>
-          <w:i w:val="0"/>
-          <w:iCs w:val="0"/>
-          <w:smallCaps w:val="0"/>
-          <w:strike w:val="0"/>
-          <w:color w:val="333333"/>
-          <w:sz w:val="20"/>
-          <w:szCs w:val="20"/>
-          <w:u w:val="none"/>
-          <w:shd w:fill="auto" w:val="clear"/>
-          <w:vertAlign w:val="baseline"/>
-          <w:rtl w:val="0"/>
-        </w:rPr>
-        <w:t xml:space="preserve">Spearheaded automated regression testing using Selenium and Playwright, reducing manual testing time by 10–20% and expanding test coverage across statewide software</w:t>
-      </w:r>
-      <w:r>
-        <w:rPr>
-          <w:rtl w:val="0"/>
-        </w:rPr>
-      </w:r>
-    </w:p>
-    <w:p>
-      <w:pPr>
-        <w:tabs>
-          <w:tab w:val="right" w:leader="none" w:pos="10350"/>
-        </w:tabs>
-        <w:spacing w:after="0" w:before="0" w:lineRule="auto"/>
-        <w:ind w:right="0"/>
-        <w:rPr>
-          <w:rFonts w:ascii="Arial" w:cs="Arial" w:eastAsia="Arial" w:hAnsi="Arial"/>
-          <w:i w:val="1"/>
-          <w:iCs w:val="1"/>
-          <w:color w:val="666666"/>
-          <w:sz w:val="20"/>
-          <w:szCs w:val="20"/>
-        </w:rPr>
-      </w:pPr>
-      <w:r>
-        <w:rPr>
-          <w:b w:val="1"/>
-          <w:bCs w:val="1"/>
-          <w:color w:val="1a1a1a"/>
-          <w:sz w:val="22"/>
-          <w:szCs w:val="22"/>
-          <w:rtl w:val="0"/>
-        </w:rPr>
-        <w:t xml:space="preserve">Shop Online New York</w:t>
-      </w:r>
-      <w:r>
-        <w:rPr>
-          <w:color w:val="888888"/>
-          <w:rtl w:val="0"/>
-        </w:rPr>
-        <w:tab/>
-      </w:r>
-      <w:r>
-        <w:rPr>
-          <w:i w:val="1"/>
-          <w:iCs w:val="1"/>
-          <w:color w:val="666666"/>
-          <w:rtl w:val="0"/>
-        </w:rPr>
-        <w:t xml:space="preserve">Feb</w:t>
-      </w:r>
-      <w:r>
-        <w:rPr>
-          <w:rFonts w:ascii="Arial" w:cs="Arial" w:eastAsia="Arial" w:hAnsi="Arial"/>
-          <w:i w:val="1"/>
-          <w:iCs w:val="1"/>
-          <w:color w:val="666666"/>
-          <w:sz w:val="20"/>
-          <w:szCs w:val="20"/>
-          <w:rtl w:val="0"/>
-        </w:rPr>
-        <w:t xml:space="preserve"> 2025 – Apr 2025</w:t>
-      </w:r>
-    </w:p>
-    <w:p>
-      <w:pPr>
-        <w:tabs>
-          <w:tab w:val="right" w:leader="none" w:pos="10350"/>
-        </w:tabs>
-        <w:spacing w:after="0" w:before="0" w:lineRule="auto"/>
-        <w:ind w:right="0"/>
-        <w:rPr>
-          <w:i w:val="1"/>
-          <w:iCs w:val="1"/>
-          <w:color w:val="666666"/>
-        </w:rPr>
-      </w:pPr>
-      <w:r>
-        <w:rPr>
-          <w:i w:val="1"/>
-          <w:iCs w:val="1"/>
-          <w:color w:val="1a1a1a"/>
-          <w:sz w:val="22"/>
-          <w:szCs w:val="22"/>
-          <w:rtl w:val="0"/>
-        </w:rPr>
-        <w:t xml:space="preserve">Software Developer Intern</w:t>
+        <w:rPr>
+          <w:rFonts w:ascii="Times New Roman" w:cs="Times New Roman" w:eastAsia="Times New Roman" w:hAnsi="Times New Roman"/>
+        </w:rPr>
+      </w:pPr>
+      <w:r>
+        <w:rPr>
+          <w:rFonts w:ascii="Times New Roman" w:cs="Times New Roman" w:eastAsia="Times New Roman" w:hAnsi="Times New Roman"/>
+          <w:color w:val="333333"/>
+          <w:rtl w:val="0"/>
+        </w:rPr>
+        <w:t xml:space="preserve">Delivered individualized mathematics instruction from arithmetic through calculus II, improving student performance by an average of one letter grade through structured problem-solving methods</w:t>
       </w:r>
       <w:r>
         <w:rPr>
@@ -903,342 +1115,20 @@
           <w:between w:space="0" w:sz="0" w:val="nil"/>
         </w:pBdr>
         <w:shd w:fill="auto" w:val="clear"/>
-        <w:tabs>
-          <w:tab w:val="right" w:leader="none" w:pos="10350"/>
-        </w:tabs>
-        <w:spacing w:after="0" w:afterAutospacing="0" w:before="0" w:line="240" w:lineRule="auto"/>
+        <w:spacing w:after="40" w:before="40" w:line="240" w:lineRule="auto"/>
         <w:ind w:left="440" w:right="0" w:hanging="260"/>
         <w:jc w:val="left"/>
-      </w:pPr>
-      <w:r>
-        <w:rPr>
-          <w:color w:val="333333"/>
-          <w:rtl w:val="0"/>
-        </w:rPr>
-        <w:t xml:space="preserve">Built a cross-platform Flutter application supporting 4 distinct user roles (user, admin, seller, buyer) with role-based access controls, reducing authorization defects and improving navigation clarity</w:t>
-      </w:r>
-    </w:p>
-    <w:p>
-      <w:pPr>
-        <w:keepNext w:val="0"/>
-        <w:keepLines w:val="0"/>
-        <w:pageBreakBefore w:val="0"/>
-        <w:widowControl w:val="1"/>
-        <w:numPr>
-          <w:ilvl w:val="0"/>
-          <w:numId w:val="1"/>
-        </w:numPr>
-        <w:pBdr>
-          <w:top w:space="0" w:sz="0" w:val="nil"/>
-          <w:left w:space="0" w:sz="0" w:val="nil"/>
-          <w:bottom w:space="0" w:sz="0" w:val="nil"/>
-          <w:right w:space="0" w:sz="0" w:val="nil"/>
-          <w:between w:space="0" w:sz="0" w:val="nil"/>
-        </w:pBdr>
-        <w:shd w:fill="auto" w:val="clear"/>
-        <w:tabs>
-          <w:tab w:val="right" w:leader="none" w:pos="10350"/>
-        </w:tabs>
-        <w:spacing w:after="40" w:before="0" w:beforeAutospacing="0" w:line="240" w:lineRule="auto"/>
-        <w:ind w:left="440" w:right="0" w:hanging="260"/>
-        <w:jc w:val="left"/>
-      </w:pPr>
-      <w:r>
-        <w:rPr>
-          <w:color w:val="333333"/>
-          <w:rtl w:val="0"/>
-        </w:rPr>
-        <w:t xml:space="preserve">Integrated Firebase for real-time data management, authentication, and cloud storage; managed end-to-end Jira ticket lifecycle for this workstream</w:t>
-      </w:r>
-    </w:p>
-    <w:p>
-      <w:pPr>
-        <w:tabs>
-          <w:tab w:val="right" w:leader="none" w:pos="10080"/>
-        </w:tabs>
-        <w:spacing w:after="0" w:before="0" w:lineRule="auto"/>
-        <w:ind w:right="0"/>
-        <w:rPr>
-          <w:rFonts w:ascii="Arial" w:cs="Arial" w:eastAsia="Arial" w:hAnsi="Arial"/>
-          <w:i w:val="1"/>
-          <w:iCs w:val="1"/>
-          <w:color w:val="666666"/>
-          <w:sz w:val="20"/>
-          <w:szCs w:val="20"/>
-        </w:rPr>
-      </w:pPr>
-      <w:r>
-        <w:rPr>
-          <w:b w:val="1"/>
-          <w:bCs w:val="1"/>
-          <w:color w:val="1a1a1a"/>
-          <w:sz w:val="22"/>
-          <w:szCs w:val="22"/>
-          <w:rtl w:val="0"/>
-        </w:rPr>
-        <w:t xml:space="preserve">Florida State University</w:t>
-      </w:r>
-      <w:r>
-        <w:rPr>
-          <w:color w:val="888888"/>
-          <w:rtl w:val="0"/>
-        </w:rPr>
-        <w:t xml:space="preserve"> </w:t>
-        <w:tab/>
-      </w:r>
-      <w:r>
-        <w:rPr>
-          <w:i w:val="1"/>
-          <w:iCs w:val="1"/>
-          <w:color w:val="666666"/>
-          <w:rtl w:val="0"/>
-        </w:rPr>
-        <w:t xml:space="preserve">Sep</w:t>
-      </w:r>
-      <w:r>
-        <w:rPr>
-          <w:rFonts w:ascii="Arial" w:cs="Arial" w:eastAsia="Arial" w:hAnsi="Arial"/>
-          <w:i w:val="1"/>
-          <w:iCs w:val="1"/>
-          <w:color w:val="666666"/>
-          <w:sz w:val="20"/>
-          <w:szCs w:val="20"/>
-          <w:rtl w:val="0"/>
-        </w:rPr>
-        <w:t xml:space="preserve"> 2023 – May 2024</w:t>
-      </w:r>
-    </w:p>
-    <w:p>
-      <w:pPr>
-        <w:tabs>
-          <w:tab w:val="right" w:leader="none" w:pos="10350"/>
-        </w:tabs>
-        <w:spacing w:after="0" w:before="0" w:lineRule="auto"/>
-        <w:ind w:right="0"/>
-        <w:rPr>
-          <w:i w:val="1"/>
-          <w:iCs w:val="1"/>
-          <w:color w:val="666666"/>
-        </w:rPr>
-      </w:pPr>
-      <w:r>
-        <w:rPr>
-          <w:i w:val="1"/>
-          <w:iCs w:val="1"/>
-          <w:color w:val="1a1a1a"/>
-          <w:sz w:val="22"/>
-          <w:szCs w:val="22"/>
-          <w:rtl w:val="0"/>
-        </w:rPr>
-        <w:t xml:space="preserve">Cybersecurity Analyst Intern</w:t>
-      </w:r>
-      <w:r>
-        <w:rPr>
-          <w:rtl w:val="0"/>
-        </w:rPr>
-      </w:r>
-    </w:p>
-    <w:p>
-      <w:pPr>
-        <w:keepNext w:val="0"/>
-        <w:keepLines w:val="0"/>
-        <w:pageBreakBefore w:val="0"/>
-        <w:widowControl w:val="1"/>
-        <w:numPr>
-          <w:ilvl w:val="0"/>
-          <w:numId w:val="1"/>
-        </w:numPr>
-        <w:pBdr>
-          <w:top w:space="0" w:sz="0" w:val="nil"/>
-          <w:left w:space="0" w:sz="0" w:val="nil"/>
-          <w:bottom w:space="0" w:sz="0" w:val="nil"/>
-          <w:right w:space="0" w:sz="0" w:val="nil"/>
-          <w:between w:space="0" w:sz="0" w:val="nil"/>
-        </w:pBdr>
-        <w:shd w:fill="auto" w:val="clear"/>
-        <w:tabs>
-          <w:tab w:val="right" w:leader="none" w:pos="10350"/>
-        </w:tabs>
-        <w:spacing w:after="0" w:afterAutospacing="0" w:before="0" w:line="240" w:lineRule="auto"/>
-        <w:ind w:left="440" w:right="0" w:hanging="260"/>
-        <w:jc w:val="left"/>
-      </w:pPr>
-      <w:r>
-        <w:rPr>
-          <w:color w:val="333333"/>
-          <w:rtl w:val="0"/>
-        </w:rPr>
-        <w:t xml:space="preserve">Standardized security procedures and compliance controls for FSU Health Research teams, aligning operations to NIST 800-53 and FedRAMP Moderate baselines — reducing audit preparation effort and compliance ambiguity</w:t>
-      </w:r>
-    </w:p>
-    <w:p>
-      <w:pPr>
-        <w:keepNext w:val="0"/>
-        <w:keepLines w:val="0"/>
-        <w:pageBreakBefore w:val="0"/>
-        <w:widowControl w:val="1"/>
-        <w:numPr>
-          <w:ilvl w:val="0"/>
-          <w:numId w:val="1"/>
-        </w:numPr>
-        <w:pBdr>
-          <w:top w:space="0" w:sz="0" w:val="nil"/>
-          <w:left w:space="0" w:sz="0" w:val="nil"/>
-          <w:bottom w:space="0" w:sz="0" w:val="nil"/>
-          <w:right w:space="0" w:sz="0" w:val="nil"/>
-          <w:between w:space="0" w:sz="0" w:val="nil"/>
-        </w:pBdr>
-        <w:shd w:fill="auto" w:val="clear"/>
-        <w:tabs>
-          <w:tab w:val="right" w:leader="none" w:pos="10350"/>
-        </w:tabs>
-        <w:spacing w:after="40" w:before="0" w:beforeAutospacing="0" w:line="240" w:lineRule="auto"/>
-        <w:ind w:left="440" w:right="0" w:hanging="260"/>
-        <w:jc w:val="left"/>
-      </w:pPr>
-      <w:r>
-        <w:rPr>
-          <w:color w:val="333333"/>
-          <w:rtl w:val="0"/>
-        </w:rPr>
-        <w:t xml:space="preserve">Conducted security assessments and risk analysis of Azure and Alert Logic integrations for the Health Data Science Initiative, identifying control gaps across identity, logging, and data protection layers</w:t>
-      </w:r>
-    </w:p>
-    <w:p>
-      <w:pPr>
-        <w:tabs>
-          <w:tab w:val="right" w:leader="none" w:pos="10080"/>
-        </w:tabs>
-        <w:spacing w:after="0" w:before="0" w:lineRule="auto"/>
-        <w:ind w:right="0"/>
-        <w:rPr>
-          <w:i w:val="1"/>
-          <w:iCs w:val="1"/>
-          <w:color w:val="666666"/>
-        </w:rPr>
-      </w:pPr>
-      <w:r>
-        <w:rPr>
-          <w:b w:val="1"/>
-          <w:bCs w:val="1"/>
-          <w:color w:val="1a1a1a"/>
-          <w:sz w:val="22"/>
-          <w:szCs w:val="22"/>
-          <w:rtl w:val="0"/>
-        </w:rPr>
-        <w:t xml:space="preserve">Mathnasium </w:t>
-      </w:r>
-      <w:r>
-        <w:rPr>
-          <w:color w:val="888888"/>
-          <w:rtl w:val="0"/>
-        </w:rPr>
-        <w:tab/>
-      </w:r>
-      <w:r>
-        <w:rPr>
-          <w:i w:val="1"/>
-          <w:iCs w:val="1"/>
-          <w:color w:val="666666"/>
-          <w:rtl w:val="0"/>
-        </w:rPr>
-        <w:t xml:space="preserve">Sep 2022 – Aug 2023</w:t>
-      </w:r>
-    </w:p>
-    <w:p>
-      <w:pPr>
-        <w:tabs>
-          <w:tab w:val="right" w:leader="none" w:pos="10350"/>
-        </w:tabs>
-        <w:spacing w:after="0" w:before="0" w:lineRule="auto"/>
-        <w:ind w:right="0"/>
-        <w:rPr>
-          <w:i w:val="1"/>
-          <w:iCs w:val="1"/>
-          <w:color w:val="666666"/>
-        </w:rPr>
-      </w:pPr>
-      <w:r>
-        <w:rPr>
-          <w:i w:val="1"/>
-          <w:iCs w:val="1"/>
-          <w:color w:val="1a1a1a"/>
-          <w:sz w:val="22"/>
-          <w:szCs w:val="22"/>
-          <w:rtl w:val="0"/>
-        </w:rPr>
-        <w:t xml:space="preserve">Mathematics Tutor</w:t>
-      </w:r>
-      <w:r>
-        <w:rPr>
-          <w:rtl w:val="0"/>
-        </w:rPr>
-      </w:r>
-    </w:p>
-    <w:p>
-      <w:pPr>
-        <w:keepNext w:val="0"/>
-        <w:keepLines w:val="0"/>
-        <w:pageBreakBefore w:val="0"/>
-        <w:widowControl w:val="1"/>
-        <w:numPr>
-          <w:ilvl w:val="0"/>
-          <w:numId w:val="1"/>
-        </w:numPr>
-        <w:pBdr>
-          <w:top w:space="0" w:sz="0" w:val="nil"/>
-          <w:left w:space="0" w:sz="0" w:val="nil"/>
-          <w:bottom w:space="0" w:sz="0" w:val="nil"/>
-          <w:right w:space="0" w:sz="0" w:val="nil"/>
-          <w:between w:space="0" w:sz="0" w:val="nil"/>
-        </w:pBdr>
-        <w:shd w:fill="auto" w:val="clear"/>
-        <w:tabs>
-          <w:tab w:val="right" w:leader="none" w:pos="10350"/>
-        </w:tabs>
-        <w:spacing w:after="0" w:afterAutospacing="0" w:before="0" w:line="240" w:lineRule="auto"/>
-        <w:ind w:left="440" w:right="0" w:hanging="260"/>
-        <w:jc w:val="left"/>
-      </w:pPr>
-      <w:r>
-        <w:rPr>
-          <w:color w:val="333333"/>
-          <w:rtl w:val="0"/>
-        </w:rPr>
-        <w:t xml:space="preserve">Delivered individualized math instruction across arithmetic through pre-calculus, improving students' grades by an average of one letter grade through tailored problem-solving strategies</w:t>
-      </w:r>
-    </w:p>
-    <w:p>
-      <w:pPr>
-        <w:keepNext w:val="0"/>
-        <w:keepLines w:val="0"/>
-        <w:pageBreakBefore w:val="0"/>
-        <w:widowControl w:val="1"/>
-        <w:numPr>
-          <w:ilvl w:val="0"/>
-          <w:numId w:val="1"/>
-        </w:numPr>
-        <w:pBdr>
-          <w:top w:space="0" w:sz="0" w:val="nil"/>
-          <w:left w:space="0" w:sz="0" w:val="nil"/>
-          <w:bottom w:space="0" w:sz="0" w:val="nil"/>
-          <w:right w:space="0" w:sz="0" w:val="nil"/>
-          <w:between w:space="0" w:sz="0" w:val="nil"/>
-        </w:pBdr>
-        <w:shd w:fill="auto" w:val="clear"/>
-        <w:tabs>
-          <w:tab w:val="right" w:leader="none" w:pos="10350"/>
-        </w:tabs>
-        <w:spacing w:after="40" w:before="0" w:beforeAutospacing="0" w:line="240" w:lineRule="auto"/>
-        <w:ind w:left="440" w:right="0" w:hanging="260"/>
-        <w:jc w:val="left"/>
-      </w:pPr>
-      <w:r>
-        <w:rPr>
-          <w:color w:val="333333"/>
-          <w:rtl w:val="0"/>
-        </w:rPr>
-        <w:t xml:space="preserve">Prepared students for college admission standardized tests, achieving 20%+ average improvement on math sections — demonstrating ability to translate quantitative concepts into accessible, structured explanations</w:t>
+        <w:rPr>
+          <w:rFonts w:ascii="Times New Roman" w:cs="Times New Roman" w:eastAsia="Times New Roman" w:hAnsi="Times New Roman"/>
+        </w:rPr>
+      </w:pPr>
+      <w:r>
+        <w:rPr>
+          <w:rFonts w:ascii="Times New Roman" w:cs="Times New Roman" w:eastAsia="Times New Roman" w:hAnsi="Times New Roman"/>
+          <w:color w:val="333333"/>
+          <w:rtl w:val="0"/>
+        </w:rPr>
+        <w:t xml:space="preserve">Prepared students for college admission exams, achieving 20%+ average score improvement, demonstrating ability to translate complex quantitative concepts into clear, accessible explanations</w:t>
       </w:r>
     </w:p>
     <w:p>
@@ -1249,10 +1139,13 @@
         </w:pBdr>
         <w:spacing w:after="60" w:before="200" w:lineRule="auto"/>
         <w:ind w:right="0"/>
-        <w:rPr/>
-      </w:pPr>
-      <w:r>
-        <w:rPr>
+        <w:rPr>
+          <w:rFonts w:ascii="Times New Roman" w:cs="Times New Roman" w:eastAsia="Times New Roman" w:hAnsi="Times New Roman"/>
+        </w:rPr>
+      </w:pPr>
+      <w:r>
+        <w:rPr>
+          <w:rFonts w:ascii="Times New Roman" w:cs="Times New Roman" w:eastAsia="Times New Roman" w:hAnsi="Times New Roman"/>
           <w:b w:val="1"/>
           <w:bCs w:val="1"/>
           <w:sz w:val="24"/>
@@ -1272,13 +1165,14 @@
         <w:spacing w:after="40" w:before="0" w:lineRule="auto"/>
         <w:ind w:right="0"/>
         <w:rPr>
-          <w:sz w:val="22"/>
-          <w:szCs w:val="22"/>
-        </w:rPr>
-      </w:pPr>
-      <w:r>
-        <w:rPr>
-          <w:rFonts w:ascii="Arial" w:cs="Arial" w:eastAsia="Arial" w:hAnsi="Arial"/>
+          <w:rFonts w:ascii="Times New Roman" w:cs="Times New Roman" w:eastAsia="Times New Roman" w:hAnsi="Times New Roman"/>
+          <w:sz w:val="22"/>
+          <w:szCs w:val="22"/>
+        </w:rPr>
+      </w:pPr>
+      <w:r>
+        <w:rPr>
+          <w:rFonts w:ascii="Times New Roman" w:cs="Times New Roman" w:eastAsia="Times New Roman" w:hAnsi="Times New Roman"/>
           <w:b w:val="1"/>
           <w:bCs w:val="1"/>
           <w:color w:val="1a1a1a"/>
@@ -1290,7 +1184,7 @@
       </w:r>
       <w:r>
         <w:rPr>
-          <w:rFonts w:ascii="Arial" w:cs="Arial" w:eastAsia="Arial" w:hAnsi="Arial"/>
+          <w:rFonts w:ascii="Times New Roman" w:cs="Times New Roman" w:eastAsia="Times New Roman" w:hAnsi="Times New Roman"/>
           <w:i w:val="1"/>
           <w:iCs w:val="1"/>
           <w:color w:val="666666"/>
@@ -1308,102 +1202,44 @@
     </w:p>
     <w:p>
       <w:pPr>
-        <w:keepNext w:val="0"/>
-        <w:keepLines w:val="0"/>
-        <w:pageBreakBefore w:val="0"/>
-        <w:widowControl w:val="1"/>
         <w:numPr>
           <w:ilvl w:val="0"/>
           <w:numId w:val="1"/>
         </w:numPr>
-        <w:pBdr>
-          <w:top w:space="0" w:sz="0" w:val="nil"/>
-          <w:left w:space="0" w:sz="0" w:val="nil"/>
-          <w:bottom w:space="0" w:sz="0" w:val="nil"/>
-          <w:right w:space="0" w:sz="0" w:val="nil"/>
-          <w:between w:space="0" w:sz="0" w:val="nil"/>
-        </w:pBdr>
-        <w:shd w:fill="auto" w:val="clear"/>
-        <w:tabs>
-          <w:tab w:val="right" w:leader="none" w:pos="10350"/>
-        </w:tabs>
-        <w:spacing w:after="0" w:before="0" w:line="240" w:lineRule="auto"/>
-        <w:ind w:left="440" w:right="0" w:hanging="260"/>
-        <w:jc w:val="left"/>
-      </w:pPr>
-      <w:r>
-        <w:rPr>
-          <w:color w:val="333333"/>
-          <w:rtl w:val="0"/>
-        </w:rPr>
-        <w:t xml:space="preserve">Built</w:t>
-      </w:r>
-      <w:r>
-        <w:rPr>
-          <w:rFonts w:ascii="Arial" w:cs="Arial" w:eastAsia="Arial" w:hAnsi="Arial"/>
-          <w:b w:val="0"/>
-          <w:bCs w:val="0"/>
-          <w:i w:val="0"/>
-          <w:iCs w:val="0"/>
-          <w:smallCaps w:val="0"/>
-          <w:strike w:val="0"/>
-          <w:color w:val="333333"/>
-          <w:sz w:val="20"/>
-          <w:szCs w:val="20"/>
-          <w:u w:val="none"/>
-          <w:shd w:fill="auto" w:val="clear"/>
-          <w:vertAlign w:val="baseline"/>
-          <w:rtl w:val="0"/>
-        </w:rPr>
-        <w:t xml:space="preserve"> an end-to-end automated pipeline using the Azure DevOps REST API and self-hosted LLMs (Ollama) to ingest requirements, developer resolutions, and Jira issues and generate templated, reusable test cases</w:t>
-      </w:r>
-      <w:r>
-        <w:rPr>
-          <w:rtl w:val="0"/>
-        </w:rPr>
-      </w:r>
-    </w:p>
-    <w:p>
-      <w:pPr>
-        <w:keepNext w:val="0"/>
-        <w:keepLines w:val="0"/>
-        <w:pageBreakBefore w:val="0"/>
-        <w:widowControl w:val="1"/>
+        <w:spacing w:after="60" w:lineRule="auto"/>
+        <w:ind w:left="440" w:hanging="260"/>
+        <w:rPr>
+          <w:rFonts w:ascii="Times New Roman" w:cs="Times New Roman" w:eastAsia="Times New Roman" w:hAnsi="Times New Roman"/>
+        </w:rPr>
+      </w:pPr>
+      <w:r>
+        <w:rPr>
+          <w:rFonts w:ascii="Times New Roman" w:cs="Times New Roman" w:eastAsia="Times New Roman" w:hAnsi="Times New Roman"/>
+          <w:color w:val="333333"/>
+          <w:rtl w:val="0"/>
+        </w:rPr>
+        <w:t xml:space="preserve">Built an automated pipeline leveraging the Azure DevOps REST API and self-hosted LLMs (Ollama) to ingest requirements, resolutions, and Jira artifacts and generate structured, reusable validation outputs</w:t>
+      </w:r>
+    </w:p>
+    <w:p>
+      <w:pPr>
         <w:numPr>
           <w:ilvl w:val="0"/>
           <w:numId w:val="1"/>
         </w:numPr>
-        <w:pBdr>
-          <w:top w:space="0" w:sz="0" w:val="nil"/>
-          <w:left w:space="0" w:sz="0" w:val="nil"/>
-          <w:bottom w:space="0" w:sz="0" w:val="nil"/>
-          <w:right w:space="0" w:sz="0" w:val="nil"/>
-          <w:between w:space="0" w:sz="0" w:val="nil"/>
-        </w:pBdr>
-        <w:shd w:fill="auto" w:val="clear"/>
-        <w:spacing w:after="60" w:before="0" w:line="240" w:lineRule="auto"/>
-        <w:ind w:left="440" w:right="0" w:hanging="260"/>
-        <w:jc w:val="left"/>
-        <w:rPr/>
-      </w:pPr>
-      <w:r>
-        <w:rPr>
-          <w:rFonts w:ascii="Arial" w:cs="Arial" w:eastAsia="Arial" w:hAnsi="Arial"/>
-          <w:b w:val="0"/>
-          <w:bCs w:val="0"/>
-          <w:i w:val="0"/>
-          <w:iCs w:val="0"/>
-          <w:smallCaps w:val="0"/>
-          <w:strike w:val="0"/>
-          <w:color w:val="333333"/>
-          <w:sz w:val="20"/>
-          <w:szCs w:val="20"/>
-          <w:u w:val="none"/>
-          <w:shd w:fill="auto" w:val="clear"/>
-          <w:vertAlign w:val="baseline"/>
-          <w:rtl w:val="0"/>
-        </w:rPr>
-        <w:t xml:space="preserve">Linked generated test cases directly to requirements and release versions, improving traceability and per-release test coverage while reducing manual test design effort</w:t>
+        <w:spacing w:after="60" w:lineRule="auto"/>
+        <w:ind w:left="440" w:hanging="260"/>
+        <w:rPr>
+          <w:rFonts w:ascii="Times New Roman" w:cs="Times New Roman" w:eastAsia="Times New Roman" w:hAnsi="Times New Roman"/>
+        </w:rPr>
+      </w:pPr>
+      <w:r>
+        <w:rPr>
+          <w:rFonts w:ascii="Times New Roman" w:cs="Times New Roman" w:eastAsia="Times New Roman" w:hAnsi="Times New Roman"/>
+          <w:color w:val="333333"/>
+          <w:rtl w:val="0"/>
+        </w:rPr>
+        <w:t xml:space="preserve">Established requirement-to-release traceability, improving per-release coverage and reducing manual analysis effort while strengthening auditability and change-impact assessment</w:t>
       </w:r>
       <w:r>
         <w:rPr>
@@ -1416,13 +1252,14 @@
         <w:spacing w:after="40" w:before="0" w:lineRule="auto"/>
         <w:ind w:right="0"/>
         <w:rPr>
-          <w:sz w:val="22"/>
-          <w:szCs w:val="22"/>
-        </w:rPr>
-      </w:pPr>
-      <w:r>
-        <w:rPr>
-          <w:rFonts w:ascii="Arial" w:cs="Arial" w:eastAsia="Arial" w:hAnsi="Arial"/>
+          <w:rFonts w:ascii="Times New Roman" w:cs="Times New Roman" w:eastAsia="Times New Roman" w:hAnsi="Times New Roman"/>
+          <w:sz w:val="22"/>
+          <w:szCs w:val="22"/>
+        </w:rPr>
+      </w:pPr>
+      <w:r>
+        <w:rPr>
+          <w:rFonts w:ascii="Times New Roman" w:cs="Times New Roman" w:eastAsia="Times New Roman" w:hAnsi="Times New Roman"/>
           <w:b w:val="1"/>
           <w:bCs w:val="1"/>
           <w:color w:val="1a1a1a"/>
@@ -1434,7 +1271,7 @@
       </w:r>
       <w:r>
         <w:rPr>
-          <w:rFonts w:ascii="Arial" w:cs="Arial" w:eastAsia="Arial" w:hAnsi="Arial"/>
+          <w:rFonts w:ascii="Times New Roman" w:cs="Times New Roman" w:eastAsia="Times New Roman" w:hAnsi="Times New Roman"/>
           <w:i w:val="1"/>
           <w:iCs w:val="1"/>
           <w:color w:val="666666"/>
@@ -1452,224 +1289,135 @@
     </w:p>
     <w:p>
       <w:pPr>
-        <w:keepNext w:val="0"/>
-        <w:keepLines w:val="0"/>
-        <w:pageBreakBefore w:val="0"/>
-        <w:widowControl w:val="1"/>
         <w:numPr>
           <w:ilvl w:val="0"/>
           <w:numId w:val="1"/>
         </w:numPr>
-        <w:pBdr>
-          <w:top w:space="0" w:sz="0" w:val="nil"/>
-          <w:left w:space="0" w:sz="0" w:val="nil"/>
-          <w:bottom w:space="0" w:sz="0" w:val="nil"/>
-          <w:right w:space="0" w:sz="0" w:val="nil"/>
-          <w:between w:space="0" w:sz="0" w:val="nil"/>
-        </w:pBdr>
-        <w:shd w:fill="auto" w:val="clear"/>
         <w:tabs>
           <w:tab w:val="right" w:leader="none" w:pos="10350"/>
         </w:tabs>
-        <w:spacing w:after="0" w:before="0" w:line="240" w:lineRule="auto"/>
-        <w:ind w:left="440" w:right="0" w:hanging="260"/>
-        <w:jc w:val="left"/>
-      </w:pPr>
-      <w:r>
-        <w:rPr>
-          <w:color w:val="333333"/>
-          <w:rtl w:val="0"/>
-        </w:rPr>
-        <w:t xml:space="preserve">Built</w:t>
-      </w:r>
-      <w:r>
-        <w:rPr>
-          <w:rFonts w:ascii="Arial" w:cs="Arial" w:eastAsia="Arial" w:hAnsi="Arial"/>
-          <w:b w:val="0"/>
-          <w:bCs w:val="0"/>
-          <w:i w:val="0"/>
-          <w:iCs w:val="0"/>
-          <w:smallCaps w:val="0"/>
-          <w:strike w:val="0"/>
-          <w:color w:val="333333"/>
-          <w:sz w:val="20"/>
-          <w:szCs w:val="20"/>
-          <w:u w:val="none"/>
-          <w:shd w:fill="auto" w:val="clear"/>
-          <w:vertAlign w:val="baseline"/>
-          <w:rtl w:val="0"/>
-        </w:rPr>
-        <w:t xml:space="preserve"> an end-to-end Azure data platform to ingest, transform, and prepare multi-source enterprise data for analytics; implemented data quality checks and governance controls</w:t>
-      </w:r>
-      <w:r>
-        <w:rPr>
-          <w:color w:val="333333"/>
-          <w:rtl w:val="0"/>
-        </w:rPr>
-        <w:t xml:space="preserve">,</w:t>
-      </w:r>
-      <w:r>
-        <w:rPr>
-          <w:rFonts w:ascii="Arial" w:cs="Arial" w:eastAsia="Arial" w:hAnsi="Arial"/>
-          <w:b w:val="0"/>
-          <w:bCs w:val="0"/>
-          <w:i w:val="0"/>
-          <w:iCs w:val="0"/>
-          <w:smallCaps w:val="0"/>
-          <w:strike w:val="0"/>
-          <w:color w:val="333333"/>
-          <w:sz w:val="20"/>
-          <w:szCs w:val="20"/>
-          <w:u w:val="none"/>
-          <w:shd w:fill="auto" w:val="clear"/>
-          <w:vertAlign w:val="baseline"/>
-          <w:rtl w:val="0"/>
-        </w:rPr>
-        <w:t xml:space="preserve"> feeding reliable Power BI dashboards</w:t>
-      </w:r>
-      <w:r>
-        <w:rPr>
-          <w:rtl w:val="0"/>
-        </w:rPr>
-      </w:r>
-    </w:p>
-    <w:p>
-      <w:pPr>
-        <w:spacing w:after="40" w:before="0" w:lineRule="auto"/>
-        <w:ind w:right="0"/>
-        <w:rPr>
-          <w:sz w:val="22"/>
-          <w:szCs w:val="22"/>
-        </w:rPr>
-      </w:pPr>
-      <w:r>
-        <w:rPr>
-          <w:rFonts w:ascii="Arial" w:cs="Arial" w:eastAsia="Arial" w:hAnsi="Arial"/>
-          <w:b w:val="1"/>
-          <w:bCs w:val="1"/>
-          <w:color w:val="1a1a1a"/>
-          <w:sz w:val="22"/>
-          <w:szCs w:val="22"/>
-          <w:rtl w:val="0"/>
-        </w:rPr>
-        <w:t xml:space="preserve">Enterprise SLA Monitoring Data Platform</w:t>
-      </w:r>
-      <w:r>
-        <w:rPr>
-          <w:rFonts w:ascii="Arial" w:cs="Arial" w:eastAsia="Arial" w:hAnsi="Arial"/>
-          <w:i w:val="1"/>
-          <w:iCs w:val="1"/>
-          <w:color w:val="666666"/>
-          <w:sz w:val="22"/>
-          <w:szCs w:val="22"/>
-          <w:rtl w:val="0"/>
-        </w:rPr>
-        <w:t xml:space="preserve">  —  Azure Databricks · Medallion Architecture</w:t>
-      </w:r>
-      <w:r>
-        <w:rPr>
-          <w:rtl w:val="0"/>
-        </w:rPr>
-      </w:r>
-    </w:p>
-    <w:p>
-      <w:pPr>
-        <w:keepNext w:val="0"/>
-        <w:keepLines w:val="0"/>
-        <w:pageBreakBefore w:val="0"/>
-        <w:widowControl w:val="1"/>
+        <w:ind w:left="440" w:hanging="260"/>
+        <w:rPr>
+          <w:rFonts w:ascii="Times New Roman" w:cs="Times New Roman" w:eastAsia="Times New Roman" w:hAnsi="Times New Roman"/>
+        </w:rPr>
+      </w:pPr>
+      <w:r>
+        <w:rPr>
+          <w:rFonts w:ascii="Times New Roman" w:cs="Times New Roman" w:eastAsia="Times New Roman" w:hAnsi="Times New Roman"/>
+          <w:color w:val="333333"/>
+          <w:rtl w:val="0"/>
+        </w:rPr>
+        <w:t xml:space="preserve">Built an end-to-end Azure data platform to ingest and transform multi-source enterprise data, applying data quality checks and governance controls</w:t>
+      </w:r>
+    </w:p>
+    <w:p>
+      <w:pPr>
         <w:numPr>
           <w:ilvl w:val="0"/>
           <w:numId w:val="1"/>
         </w:numPr>
-        <w:pBdr>
-          <w:top w:space="0" w:sz="0" w:val="nil"/>
-          <w:left w:space="0" w:sz="0" w:val="nil"/>
-          <w:bottom w:space="0" w:sz="0" w:val="nil"/>
-          <w:right w:space="0" w:sz="0" w:val="nil"/>
-          <w:between w:space="0" w:sz="0" w:val="nil"/>
-        </w:pBdr>
-        <w:shd w:fill="auto" w:val="clear"/>
         <w:tabs>
           <w:tab w:val="right" w:leader="none" w:pos="10350"/>
         </w:tabs>
-        <w:spacing w:after="0" w:before="0" w:line="240" w:lineRule="auto"/>
-        <w:ind w:left="440" w:right="0" w:hanging="260"/>
-        <w:jc w:val="left"/>
-      </w:pPr>
-      <w:r>
-        <w:rPr>
-          <w:color w:val="333333"/>
-          <w:rtl w:val="0"/>
-        </w:rPr>
-        <w:t xml:space="preserve">Designed</w:t>
-      </w:r>
-      <w:r>
-        <w:rPr>
-          <w:rFonts w:ascii="Arial" w:cs="Arial" w:eastAsia="Arial" w:hAnsi="Arial"/>
-          <w:b w:val="0"/>
-          <w:bCs w:val="0"/>
-          <w:i w:val="0"/>
-          <w:iCs w:val="0"/>
-          <w:smallCaps w:val="0"/>
-          <w:strike w:val="0"/>
-          <w:color w:val="333333"/>
-          <w:sz w:val="20"/>
-          <w:szCs w:val="20"/>
-          <w:u w:val="none"/>
-          <w:shd w:fill="auto" w:val="clear"/>
-          <w:vertAlign w:val="baseline"/>
-          <w:rtl w:val="0"/>
-        </w:rPr>
-        <w:t xml:space="preserve"> a Medallion-architecture pipeline ingesting application decision data into ADLS, applying SLA classification logic in Databricks Spark SQL, and publishing Gold-layer reporting tables for operational and client-facing dashboards</w:t>
-      </w:r>
-      <w:r>
-        <w:rPr>
-          <w:rtl w:val="0"/>
-        </w:rPr>
-      </w:r>
-    </w:p>
-    <w:p>
-      <w:pPr>
-        <w:keepNext w:val="0"/>
-        <w:keepLines w:val="0"/>
-        <w:pageBreakBefore w:val="0"/>
-        <w:widowControl w:val="1"/>
+        <w:ind w:left="440" w:hanging="260"/>
+        <w:rPr>
+          <w:rFonts w:ascii="Times New Roman" w:cs="Times New Roman" w:eastAsia="Times New Roman" w:hAnsi="Times New Roman"/>
+        </w:rPr>
+      </w:pPr>
+      <w:r>
+        <w:rPr>
+          <w:rFonts w:ascii="Times New Roman" w:cs="Times New Roman" w:eastAsia="Times New Roman" w:hAnsi="Times New Roman"/>
+          <w:color w:val="333333"/>
+          <w:rtl w:val="0"/>
+        </w:rPr>
+        <w:t xml:space="preserve">Delivered curated analytical datasets and Power BI dashboards to support operational performance monitoring and sales insight</w:t>
+      </w:r>
+      <w:r>
+        <w:rPr>
+          <w:rtl w:val="0"/>
+        </w:rPr>
+      </w:r>
+    </w:p>
+    <w:p>
+      <w:pPr>
+        <w:spacing w:after="40" w:before="0" w:lineRule="auto"/>
+        <w:ind w:right="0"/>
+        <w:rPr>
+          <w:rFonts w:ascii="Times New Roman" w:cs="Times New Roman" w:eastAsia="Times New Roman" w:hAnsi="Times New Roman"/>
+          <w:sz w:val="22"/>
+          <w:szCs w:val="22"/>
+        </w:rPr>
+      </w:pPr>
+      <w:r>
+        <w:rPr>
+          <w:rFonts w:ascii="Times New Roman" w:cs="Times New Roman" w:eastAsia="Times New Roman" w:hAnsi="Times New Roman"/>
+          <w:b w:val="1"/>
+          <w:bCs w:val="1"/>
+          <w:color w:val="1a1a1a"/>
+          <w:sz w:val="22"/>
+          <w:szCs w:val="22"/>
+          <w:rtl w:val="0"/>
+        </w:rPr>
+        <w:t xml:space="preserve">Enterprise SLA Monitoring Data Platform</w:t>
+      </w:r>
+      <w:r>
+        <w:rPr>
+          <w:rFonts w:ascii="Times New Roman" w:cs="Times New Roman" w:eastAsia="Times New Roman" w:hAnsi="Times New Roman"/>
+          <w:i w:val="1"/>
+          <w:iCs w:val="1"/>
+          <w:color w:val="666666"/>
+          <w:sz w:val="22"/>
+          <w:szCs w:val="22"/>
+          <w:rtl w:val="0"/>
+        </w:rPr>
+        <w:t xml:space="preserve">  —  Azure Databricks · Medallion Architecture</w:t>
+      </w:r>
+      <w:r>
+        <w:rPr>
+          <w:rtl w:val="0"/>
+        </w:rPr>
+      </w:r>
+    </w:p>
+    <w:p>
+      <w:pPr>
         <w:numPr>
           <w:ilvl w:val="0"/>
           <w:numId w:val="1"/>
         </w:numPr>
-        <w:pBdr>
-          <w:top w:space="0" w:sz="0" w:val="nil"/>
-          <w:left w:space="0" w:sz="0" w:val="nil"/>
-          <w:bottom w:space="0" w:sz="0" w:val="nil"/>
-          <w:right w:space="0" w:sz="0" w:val="nil"/>
-          <w:between w:space="0" w:sz="0" w:val="nil"/>
-        </w:pBdr>
-        <w:shd w:fill="auto" w:val="clear"/>
-        <w:spacing w:after="60" w:before="0" w:line="240" w:lineRule="auto"/>
-        <w:ind w:left="440" w:right="0" w:hanging="260"/>
-        <w:jc w:val="left"/>
-        <w:rPr/>
-      </w:pPr>
-      <w:r>
-        <w:rPr>
-          <w:rFonts w:ascii="Arial" w:cs="Arial" w:eastAsia="Arial" w:hAnsi="Arial"/>
-          <w:b w:val="0"/>
-          <w:bCs w:val="0"/>
-          <w:i w:val="0"/>
-          <w:iCs w:val="0"/>
-          <w:smallCaps w:val="0"/>
-          <w:strike w:val="0"/>
-          <w:color w:val="333333"/>
-          <w:sz w:val="20"/>
-          <w:szCs w:val="20"/>
-          <w:u w:val="none"/>
-          <w:shd w:fill="auto" w:val="clear"/>
-          <w:vertAlign w:val="baseline"/>
-          <w:rtl w:val="0"/>
-        </w:rPr>
-        <w:t xml:space="preserve">Implemented automated data validation and reconciliation at each pipeline stage, ensuring end-to-end reporting accuracy and auditability</w:t>
+        <w:spacing w:after="60" w:lineRule="auto"/>
+        <w:ind w:left="440" w:hanging="260"/>
+        <w:rPr>
+          <w:rFonts w:ascii="Times New Roman" w:cs="Times New Roman" w:eastAsia="Times New Roman" w:hAnsi="Times New Roman"/>
+        </w:rPr>
+      </w:pPr>
+      <w:r>
+        <w:rPr>
+          <w:rFonts w:ascii="Times New Roman" w:cs="Times New Roman" w:eastAsia="Times New Roman" w:hAnsi="Times New Roman"/>
+          <w:color w:val="333333"/>
+          <w:rtl w:val="0"/>
+        </w:rPr>
+        <w:t xml:space="preserve">Designed a Medallion-architecture pipeline ingesting application decision data into ADLS, applying SLA classification logic in Databricks (Spark SQL), and publishing Gold-layer reporting tables</w:t>
+      </w:r>
+    </w:p>
+    <w:p>
+      <w:pPr>
+        <w:numPr>
+          <w:ilvl w:val="0"/>
+          <w:numId w:val="1"/>
+        </w:numPr>
+        <w:spacing w:after="60" w:lineRule="auto"/>
+        <w:ind w:left="440" w:hanging="260"/>
+        <w:rPr>
+          <w:rFonts w:ascii="Times New Roman" w:cs="Times New Roman" w:eastAsia="Times New Roman" w:hAnsi="Times New Roman"/>
+        </w:rPr>
+      </w:pPr>
+      <w:r>
+        <w:rPr>
+          <w:rFonts w:ascii="Times New Roman" w:cs="Times New Roman" w:eastAsia="Times New Roman" w:hAnsi="Times New Roman"/>
+          <w:color w:val="333333"/>
+          <w:rtl w:val="0"/>
+        </w:rPr>
+        <w:t xml:space="preserve">Implemented automated data validation and reconciliation at each pipeline stage, ensuring end-to-end accuracy, auditability, and reliability for operational and client-facing reporting</w:t>
       </w:r>
       <w:r>
         <w:rPr>
@@ -1682,12 +1430,15 @@
         <w:pBdr>
           <w:bottom w:color="1f4e79" w:space="2" w:sz="6" w:val="single"/>
         </w:pBdr>
-        <w:spacing w:after="60" w:before="200" w:lineRule="auto"/>
-        <w:ind w:right="0"/>
-        <w:rPr/>
-      </w:pPr>
-      <w:r>
-        <w:rPr>
+        <w:spacing w:after="60" w:before="120" w:lineRule="auto"/>
+        <w:ind w:right="0"/>
+        <w:rPr>
+          <w:rFonts w:ascii="Times New Roman" w:cs="Times New Roman" w:eastAsia="Times New Roman" w:hAnsi="Times New Roman"/>
+        </w:rPr>
+      </w:pPr>
+      <w:r>
+        <w:rPr>
+          <w:rFonts w:ascii="Times New Roman" w:cs="Times New Roman" w:eastAsia="Times New Roman" w:hAnsi="Times New Roman"/>
           <w:b w:val="1"/>
           <w:bCs w:val="1"/>
           <w:sz w:val="24"/>
@@ -1710,15 +1461,17 @@
         <w:spacing w:after="60" w:before="80" w:lineRule="auto"/>
         <w:ind w:right="0"/>
         <w:rPr>
-          <w:b w:val="1"/>
-          <w:bCs w:val="1"/>
-          <w:color w:val="1a1a1a"/>
-          <w:sz w:val="22"/>
-          <w:szCs w:val="22"/>
-        </w:rPr>
-      </w:pPr>
-      <w:r>
-        <w:rPr>
+          <w:rFonts w:ascii="Times New Roman" w:cs="Times New Roman" w:eastAsia="Times New Roman" w:hAnsi="Times New Roman"/>
+          <w:b w:val="1"/>
+          <w:bCs w:val="1"/>
+          <w:color w:val="1a1a1a"/>
+          <w:sz w:val="22"/>
+          <w:szCs w:val="22"/>
+        </w:rPr>
+      </w:pPr>
+      <w:r>
+        <w:rPr>
+          <w:rFonts w:ascii="Times New Roman" w:cs="Times New Roman" w:eastAsia="Times New Roman" w:hAnsi="Times New Roman"/>
           <w:b w:val="1"/>
           <w:bCs w:val="1"/>
           <w:color w:val="1a1a1a"/>
@@ -1730,6 +1483,7 @@
       </w:r>
       <w:r>
         <w:rPr>
+          <w:rFonts w:ascii="Times New Roman" w:cs="Times New Roman" w:eastAsia="Times New Roman" w:hAnsi="Times New Roman"/>
           <w:i w:val="1"/>
           <w:iCs w:val="1"/>
           <w:color w:val="666666"/>
@@ -1741,6 +1495,7 @@
       </w:r>
       <w:r>
         <w:rPr>
+          <w:rFonts w:ascii="Times New Roman" w:cs="Times New Roman" w:eastAsia="Times New Roman" w:hAnsi="Times New Roman"/>
           <w:b w:val="1"/>
           <w:bCs w:val="1"/>
           <w:color w:val="1a1a1a"/>
@@ -1752,6 +1507,7 @@
       </w:r>
       <w:r>
         <w:rPr>
+          <w:rFonts w:ascii="Times New Roman" w:cs="Times New Roman" w:eastAsia="Times New Roman" w:hAnsi="Times New Roman"/>
           <w:i w:val="1"/>
           <w:iCs w:val="1"/>
           <w:color w:val="666666"/>
@@ -1775,13 +1531,14 @@
         <w:spacing w:after="60" w:before="80" w:lineRule="auto"/>
         <w:ind w:right="0"/>
         <w:rPr>
-          <w:sz w:val="22"/>
-          <w:szCs w:val="22"/>
-        </w:rPr>
-      </w:pPr>
-      <w:r>
-        <w:rPr>
-          <w:rFonts w:ascii="Arial" w:cs="Arial" w:eastAsia="Arial" w:hAnsi="Arial"/>
+          <w:rFonts w:ascii="Times New Roman" w:cs="Times New Roman" w:eastAsia="Times New Roman" w:hAnsi="Times New Roman"/>
+          <w:sz w:val="22"/>
+          <w:szCs w:val="22"/>
+        </w:rPr>
+      </w:pPr>
+      <w:r>
+        <w:rPr>
+          <w:rFonts w:ascii="Times New Roman" w:cs="Times New Roman" w:eastAsia="Times New Roman" w:hAnsi="Times New Roman"/>
           <w:b w:val="1"/>
           <w:bCs w:val="1"/>
           <w:color w:val="1a1a1a"/>
@@ -1793,25 +1550,18 @@
       </w:r>
       <w:r>
         <w:rPr>
-          <w:rFonts w:ascii="Arial" w:cs="Arial" w:eastAsia="Arial" w:hAnsi="Arial"/>
+          <w:rFonts w:ascii="Times New Roman" w:cs="Times New Roman" w:eastAsia="Times New Roman" w:hAnsi="Times New Roman"/>
           <w:color w:val="333333"/>
           <w:sz w:val="22"/>
           <w:szCs w:val="22"/>
           <w:rtl w:val="0"/>
         </w:rPr>
         <w:t xml:space="preserve">   </w:t>
-      </w:r>
-      <w:r>
-        <w:rPr>
-          <w:color w:val="333333"/>
-          <w:sz w:val="22"/>
-          <w:szCs w:val="22"/>
-          <w:rtl w:val="0"/>
-        </w:rPr>
         <w:tab/>
       </w:r>
       <w:r>
         <w:rPr>
+          <w:rFonts w:ascii="Times New Roman" w:cs="Times New Roman" w:eastAsia="Times New Roman" w:hAnsi="Times New Roman"/>
           <w:b w:val="1"/>
           <w:bCs w:val="1"/>
           <w:color w:val="1a1a1a"/>
@@ -1823,6 +1573,7 @@
       </w:r>
       <w:r>
         <w:rPr>
+          <w:rFonts w:ascii="Times New Roman" w:cs="Times New Roman" w:eastAsia="Times New Roman" w:hAnsi="Times New Roman"/>
           <w:color w:val="333333"/>
           <w:sz w:val="22"/>
           <w:szCs w:val="22"/>
@@ -1843,11 +1594,13 @@
         </w:tabs>
         <w:spacing w:after="60" w:before="80" w:lineRule="auto"/>
         <w:ind w:right="0"/>
-        <w:rPr/>
-      </w:pPr>
-      <w:r>
-        <w:rPr>
-          <w:rFonts w:ascii="Arial" w:cs="Arial" w:eastAsia="Arial" w:hAnsi="Arial"/>
+        <w:rPr>
+          <w:rFonts w:ascii="Times New Roman" w:cs="Times New Roman" w:eastAsia="Times New Roman" w:hAnsi="Times New Roman"/>
+        </w:rPr>
+      </w:pPr>
+      <w:r>
+        <w:rPr>
+          <w:rFonts w:ascii="Times New Roman" w:cs="Times New Roman" w:eastAsia="Times New Roman" w:hAnsi="Times New Roman"/>
           <w:b w:val="1"/>
           <w:bCs w:val="1"/>
           <w:color w:val="1a1a1a"/>
@@ -1859,7 +1612,7 @@
       </w:r>
       <w:r>
         <w:rPr>
-          <w:rFonts w:ascii="Arial" w:cs="Arial" w:eastAsia="Arial" w:hAnsi="Arial"/>
+          <w:rFonts w:ascii="Times New Roman" w:cs="Times New Roman" w:eastAsia="Times New Roman" w:hAnsi="Times New Roman"/>
           <w:b w:val="1"/>
           <w:bCs w:val="1"/>
           <w:color w:val="1a1a1a"/>
@@ -1871,7 +1624,7 @@
       </w:r>
       <w:r>
         <w:rPr>
-          <w:rFonts w:ascii="Arial" w:cs="Arial" w:eastAsia="Arial" w:hAnsi="Arial"/>
+          <w:rFonts w:ascii="Times New Roman" w:cs="Times New Roman" w:eastAsia="Times New Roman" w:hAnsi="Times New Roman"/>
           <w:color w:val="333333"/>
           <w:sz w:val="20"/>
           <w:szCs w:val="20"/>

</xml_diff>